<commit_message>
Add licensed real photos to 18 presentation slides and refresh all materials
</commit_message>
<xml_diff>
--- a/交付文件/合理用药_大纲与逐页设计说明.docx
+++ b/交付文件/合理用药_大纲与逐页设计说明.docx
@@ -96,7 +96,7 @@
           </w:tcPr>
           <w:p>
             <w:r>
-              <w:t>16:9；蓝 #153E75、红 #E3464F、白 #FFFFFF；不引入其他模板色。标题约30pt，主体20—30pt。</w:t>
+              <w:t>16:9；模板蓝 #153E75、红 #E3464F、白 #FFFFFF；真实照片保留自然色。标题约30pt，主体以20—30pt为主。</w:t>
             </w:r>
           </w:p>
         </w:tc>
@@ -118,7 +118,7 @@
           </w:tcPr>
           <w:p>
             <w:r>
-              <w:t>原创矢量人物、药盒、药箱、水杯、细菌和病毒示意，均为PowerPoint可编辑形状。</w:t>
+              <w:t>18页主讲页加入9张不同的真实图库照片，按版面裁切后嵌入PPT；案例照片仅作场景示意。机制示意仍为可编辑形状。</w:t>
             </w:r>
           </w:p>
         </w:tc>
@@ -228,7 +228,7 @@
           </w:tcPr>
           <w:p>
             <w:r>
-              <w:t>PPT内含3页隐藏参考文献；PDF用于预览，编辑请使用PPTX。</w:t>
+              <w:t>PPT内含3页隐藏文献附页、2页隐藏图片来源附页；PDF用于预览，编辑请使用PPTX。</w:t>
             </w:r>
           </w:p>
         </w:tc>
@@ -442,7 +442,7 @@
     </w:p>
     <w:p>
       <w:r>
-        <w:t>视觉：蓝红白宿舍桌面插画：药盒、书本、水杯；原创可编辑矢量元素。</w:t>
+        <w:t>视觉：蓝底白字封面，右侧为手持药片的真实照片。；另嵌入真实照片：tablet-hand.jpg</w:t>
       </w:r>
     </w:p>
     <w:p>
@@ -470,7 +470,7 @@
     </w:p>
     <w:p>
       <w:r>
-        <w:t>视觉：三张等宽选择卡；不突出正确选项。</w:t>
+        <w:t>视觉：三条横向选择卡；右侧为手持药片的真实照片。；另嵌入真实照片：tablet-hand.jpg</w:t>
       </w:r>
     </w:p>
     <w:p>
@@ -554,7 +554,7 @@
     </w:p>
     <w:p>
       <w:r>
-        <w:t>视觉：四段路线图，时间比例示意。</w:t>
+        <w:t>视觉：四段路线卡各配一张校园、药房或医疗空间的真实照片。；另嵌入真实照片：college-campus.jpg、pharmacy-01.jpg、pharmacy-02.jpg、hospital-02.jpg</w:t>
       </w:r>
     </w:p>
     <w:p>
@@ -582,7 +582,7 @@
     </w:p>
     <w:p>
       <w:r>
-        <w:t>视觉：人物气泡＋两个匿名药盒；均为教学道具。</w:t>
+        <w:t>视觉：药瓶实拍照片配三条情境线索；照片不对应虚构故事。；另嵌入真实照片：pill-bottle.jpg</w:t>
       </w:r>
     </w:p>
     <w:p>
@@ -666,7 +666,7 @@
     </w:p>
     <w:p>
       <w:r>
-        <w:t>视觉：三个等权选项，保持与第一题相同的布局。</w:t>
+        <w:t>视觉：三选一卡片右侧配药瓶实拍照片。；另嵌入真实照片：pill-bottle.jpg</w:t>
       </w:r>
     </w:p>
     <w:p>
@@ -806,7 +806,7 @@
     </w:p>
     <w:p>
       <w:r>
-        <w:t>视觉：三张行动卡配药盒、分享禁止、时钟图标。</w:t>
+        <w:t>视觉：三条抗生素行动规则分别配药房、药师及药瓶实拍照片。；另嵌入真实照片：pharmacy-03.jpg、pharmacy-02.jpg、pill-bottle.jpg</w:t>
       </w:r>
     </w:p>
     <w:p>
@@ -834,7 +834,7 @@
     </w:p>
     <w:p>
       <w:r>
-        <w:t>视觉：宿舍书桌与广告气泡插画；红色警示围绕“提分保证”，不展示品牌。</w:t>
+        <w:t>视觉：校园学生实拍照片配备考产品的三项判断。；另嵌入真实照片：college-campus.jpg</w:t>
       </w:r>
     </w:p>
     <w:p>
@@ -862,7 +862,7 @@
     </w:p>
     <w:p>
       <w:r>
-        <w:t>视觉：清醒与困倦的同一人物对照；月牙眼和书本均为矢量元素。</w:t>
+        <w:t>视觉：夜间床头场景实拍照片配抗过敏药嗜睡提示。；另嵌入真实照片：evening.jpg</w:t>
       </w:r>
     </w:p>
     <w:p>
@@ -918,7 +918,7 @@
     </w:p>
     <w:p>
       <w:r>
-        <w:t>视觉：水杯、酒杯和药盒原创插画，搭配“先确认”的暂停标记。</w:t>
+        <w:t>视觉：药瓶实拍照片配饮酒与服药的三项核对提示。；另嵌入真实照片：pill-bottle.jpg</w:t>
       </w:r>
     </w:p>
     <w:p>
@@ -946,7 +946,7 @@
     </w:p>
     <w:p>
       <w:r>
-        <w:t>视觉：同一三选一模板；正确答案仅在讲者备注中，下一页给出行动结论。</w:t>
+        <w:t>视觉：三选一卡片右侧配药房实拍照片。；另嵌入真实照片：pharmacy-03.jpg</w:t>
       </w:r>
     </w:p>
     <w:p>
@@ -1002,7 +1002,7 @@
     </w:p>
     <w:p>
       <w:r>
-        <w:t>视觉：一张放大的原创示意说明书，六个编号定位区。</w:t>
+        <w:t>视觉：说明书六处阅读清单配药瓶实拍照片；提醒以实际说明书为准。；另嵌入真实照片：pill-bottle.jpg</w:t>
       </w:r>
     </w:p>
     <w:p>
@@ -1030,7 +1030,7 @@
     </w:p>
     <w:p>
       <w:r>
-        <w:t>视觉：时钟、剂量格、完整片剂三幅矢量图。</w:t>
+        <w:t>视觉：时间、剂量、剂型三张行动卡，各配一张药物或药房实拍照片。；另嵌入真实照片：pill-bottle.jpg、pharmacy-01.jpg、tablet-hand.jpg</w:t>
       </w:r>
     </w:p>
     <w:p>
@@ -1058,7 +1058,7 @@
     </w:p>
     <w:p>
       <w:r>
-        <w:t>视觉：人物对话气泡与药盒照片框；三项信息清单。</w:t>
+        <w:t>视觉：药师取药实拍照片配咨询时需要说明的三类信息。；另嵌入真实照片：pharmacy-02.jpg</w:t>
       </w:r>
     </w:p>
     <w:p>
@@ -1086,7 +1086,7 @@
     </w:p>
     <w:p>
       <w:r>
-        <w:t>视觉：红色警示区＋120大字，三级行动卡；只列主要信号。</w:t>
+        <w:t>视觉：红色120急救块、危险信号清单及医院走廊实拍照片。；另嵌入真实照片：hospital-02.jpg</w:t>
       </w:r>
     </w:p>
     <w:p>
@@ -1114,7 +1114,7 @@
     </w:p>
     <w:p>
       <w:r>
-        <w:t>视觉：可编辑药箱插画、原包装、说明书、手机记录卡。</w:t>
+        <w:t>视觉：药房实拍照片配宿舍药箱管理的三条行动提示。；另嵌入真实照片：pharmacy-01.jpg</w:t>
       </w:r>
     </w:p>
     <w:p>
@@ -1170,7 +1170,7 @@
     </w:p>
     <w:p>
       <w:r>
-        <w:t>视觉：三张线索卡：已服、待核、聚餐；小苏人物复用。</w:t>
+        <w:t>视觉：手持药片实拍照片配三条虚构综合情境线索。；另嵌入真实照片：tablet-hand.jpg</w:t>
       </w:r>
     </w:p>
     <w:p>
@@ -1198,7 +1198,7 @@
     </w:p>
     <w:p>
       <w:r>
-        <w:t>视觉：三张等权选择卡，B不过度加粗，避免提前暗示答案。</w:t>
+        <w:t>视觉：三选一卡片右侧配药房实拍照片。；另嵌入真实照片：pharmacy-01.jpg</w:t>
       </w:r>
     </w:p>
     <w:p>
@@ -1254,7 +1254,7 @@
     </w:p>
     <w:p>
       <w:r>
-        <w:t>视觉：蓝底白字收尾，红色胶囊图形；复现开场视觉。</w:t>
+        <w:t>视觉：蓝底白字收尾，右侧为医疗空间实拍照片。；另嵌入真实照片：clinic-01.jpg</w:t>
       </w:r>
     </w:p>
     <w:p>
@@ -1670,6 +1670,127 @@
       </w:r>
     </w:p>
     <w:p>
+      <w:pPr>
+        <w:pStyle w:val="Heading1"/>
+      </w:pPr>
+      <w:r>
+        <w:t>真实照片来源与许可</w:t>
+      </w:r>
+    </w:p>
+    <w:p>
+      <w:r>
+        <w:t>以下均为真实图库照片，非生成图。图库照片仅说明场景；人物、药品、建筑与小苏虚构案例无关，也不代表苏州大学校园。Pexels 与 Unsplash 许可允许将照片用于演示文稿；保留摄影者与原图链接便于复核。</w:t>
+      </w:r>
+    </w:p>
+    <w:p>
+      <w:r>
+        <w:t>tablet-hand.jpg｜Towfiqu barbhuiya｜Pexels License</w:t>
+      </w:r>
+    </w:p>
+    <w:p>
+      <w:r>
+        <w:t>https://www.pexels.com/photo/hand-holding-a-pill-15703464/</w:t>
+        <w:br/>
+        <w:t>https://www.pexels.com/license/</w:t>
+      </w:r>
+    </w:p>
+    <w:p>
+      <w:r>
+        <w:t>pill-bottle.jpg｜Pexels photo 16051935｜Pexels License</w:t>
+      </w:r>
+    </w:p>
+    <w:p>
+      <w:r>
+        <w:t>https://www.pexels.com/photo/16051935/</w:t>
+        <w:br/>
+        <w:t>https://www.pexels.com/license/</w:t>
+      </w:r>
+    </w:p>
+    <w:p>
+      <w:r>
+        <w:t>college-campus.jpg｜George Pak｜Pexels License</w:t>
+      </w:r>
+    </w:p>
+    <w:p>
+      <w:r>
+        <w:t>https://www.pexels.com/photo/7972512/</w:t>
+        <w:br/>
+        <w:t>https://www.pexels.com/license/</w:t>
+      </w:r>
+    </w:p>
+    <w:p>
+      <w:r>
+        <w:t>evening.jpg｜LZ Jian｜Pexels License</w:t>
+      </w:r>
+    </w:p>
+    <w:p>
+      <w:r>
+        <w:t>https://www.pexels.com/photo/black-lamp-beside-bed-5968800/</w:t>
+        <w:br/>
+        <w:t>https://www.pexels.com/license/</w:t>
+      </w:r>
+    </w:p>
+    <w:p>
+      <w:r>
+        <w:t>pharmacy-01.jpg｜Árpád Czapp｜Unsplash License</w:t>
+      </w:r>
+    </w:p>
+    <w:p>
+      <w:r>
+        <w:t>https://unsplash.com/photos/a-room-filled-with-lots-of-shelves-filled-with-boxes-and-boxes-tvP6pCnq9iI</w:t>
+        <w:br/>
+        <w:t>https://unsplash.com/license</w:t>
+      </w:r>
+    </w:p>
+    <w:p>
+      <w:r>
+        <w:t>pharmacy-02.jpg｜National Cancer Institute｜Unsplash License</w:t>
+      </w:r>
+    </w:p>
+    <w:p>
+      <w:r>
+        <w:t>https://unsplash.com/photos/pharmacist-reaching-for-medication-on-shelf-byGTytEGjBo</w:t>
+        <w:br/>
+        <w:t>https://unsplash.com/license</w:t>
+      </w:r>
+    </w:p>
+    <w:p>
+      <w:r>
+        <w:t>pharmacy-03.jpg｜paws and prints｜Unsplash License</w:t>
+      </w:r>
+    </w:p>
+    <w:p>
+      <w:r>
+        <w:t>https://unsplash.com/photos/sQjHIOhiL0E</w:t>
+        <w:br/>
+        <w:t>https://unsplash.com/license</w:t>
+      </w:r>
+    </w:p>
+    <w:p>
+      <w:r>
+        <w:t>hospital-02.jpg｜Tasha Kostyuk｜Unsplash License</w:t>
+      </w:r>
+    </w:p>
+    <w:p>
+      <w:r>
+        <w:t>https://unsplash.com/photos/empty-hospital-corridor-with-benches-and-doors-Pk-KuizxQv8</w:t>
+        <w:br/>
+        <w:t>https://unsplash.com/license</w:t>
+      </w:r>
+    </w:p>
+    <w:p>
+      <w:r>
+        <w:t>clinic-01.jpg｜Martha Dominguez de Gouveia｜Unsplash License</w:t>
+      </w:r>
+    </w:p>
+    <w:p>
+      <w:r>
+        <w:t>https://unsplash.com/photos/hospital-lobby-reception-with-signage-nMyM7fxpokE</w:t>
+        <w:br/>
+        <w:t>https://unsplash.com/license</w:t>
+      </w:r>
+    </w:p>
+    <w:p>
       <w:r>
         <w:t>检索日期：2026-10-09。网页更新时间可能改变；论文数值按上述固定发表版本使用。全文由课堂语言转述，未照搬整段原文或未授权品牌图像。</w:t>
       </w:r>

</xml_diff>

<commit_message>
deliver: refresh outline and visual design guide
</commit_message>
<xml_diff>
--- a/交付文件/合理用药_大纲与逐页设计说明.docx
+++ b/交付文件/合理用药_大纲与逐页设计说明.docx
@@ -96,7 +96,7 @@
           </w:tcPr>
           <w:p>
             <w:r>
-              <w:t>16:9；模板蓝 #153E75、红 #E3464F、白 #FFFFFF；真实照片保留自然色。标题约30pt，主体以20—30pt为主。</w:t>
+              <w:t>16:9；模板蓝 #153E75、红 #E3464F、白 #FFFFFF；图示采用青绿、紫色、橙黄点缀；真实照片保留自然色。标题约30pt，主体以20—30pt为主。</w:t>
             </w:r>
           </w:p>
         </w:tc>
@@ -118,7 +118,7 @@
           </w:tcPr>
           <w:p>
             <w:r>
-              <w:t>18页主讲页加入9张不同的真实图库照片，按版面裁切后嵌入PPT；案例照片仅作场景示意。机制示意仍为可编辑形状。</w:t>
+              <w:t>12页主讲页保留9张图库照片；两页情境改为三格原创漫画，机制图和成分示意均为可编辑形状。</w:t>
             </w:r>
           </w:p>
         </w:tc>
@@ -140,7 +140,7 @@
           </w:tcPr>
           <w:p>
             <w:r>
-              <w:t>第8页为PowerPoint原生图表；第13页为可编辑矢量图，含不确定性区间。</w:t>
+              <w:t>第8页为宿舍用药信息核对案例；第13页为同一刻度的两条独立估计，含95%不确定性区间。</w:t>
             </w:r>
           </w:p>
         </w:tc>
@@ -162,7 +162,7 @@
           </w:tcPr>
           <w:p>
             <w:r>
-              <w:t>三次穿插投票＋一题综合挑战；A/B/C举手，不要求开放表达。</w:t>
+              <w:t>2道单选与2道多选；室友群建议点赞，逐条举手，多选可重复举手。</w:t>
             </w:r>
           </w:p>
         </w:tc>
@@ -206,7 +206,7 @@
           </w:tcPr>
           <w:p>
             <w:r>
-              <w:t>蛋白质结构与功能、受体与信号、细菌和病毒、变异与自然选择。</w:t>
+              <w:t>从用药现象引出信号传递；细菌和病毒；变异与自然选择；组胺双路径。</w:t>
             </w:r>
           </w:p>
         </w:tc>
@@ -312,7 +312,7 @@
           </w:tcPr>
           <w:p>
             <w:r>
-              <w:t>开场情境；合理用药四原则；靶点示意；四段路线。</w:t>
+              <w:t>开场路线；情境选择；合理用药四原则；用药现象与信号传递。</w:t>
             </w:r>
           </w:p>
         </w:tc>
@@ -344,7 +344,7 @@
           </w:tcPr>
           <w:p>
             <w:r>
-              <w:t>重复成分；两篇研究图表；抗生素与耐药；备考产品；抗过敏嗜睡；酒精相互作用。</w:t>
+              <w:t>重复成分；已服药信息核对；抗生素与耐药负担图；备考产品；抗过敏嗜睡；酒精相互作用。</w:t>
             </w:r>
           </w:p>
         </w:tc>
@@ -408,7 +408,7 @@
           </w:tcPr>
           <w:p>
             <w:r>
-              <w:t>复方感冒药＋聚餐情境；三选一；逐项揭晓；三句收尾。</w:t>
+              <w:t>复方感冒药＋聚餐情境；多选建议；逐项揭晓；三句收尾。</w:t>
             </w:r>
           </w:p>
         </w:tc>
@@ -455,12 +455,40 @@
         <w:pStyle w:val="Heading2"/>
       </w:pPr>
       <w:r>
-        <w:t>02｜室友感冒了，你先做哪一步？</w:t>
+        <w:t>02｜今天的路线：从会判断，到会行动</w:t>
       </w:r>
     </w:p>
     <w:p>
       <w:r>
-        <w:t>页面短文案：A 先吃室友推荐的两种感冒药；B 先看症状、成分和注意事项；C 先加一粒抗生素，求个安心</w:t>
+        <w:t>页面短文案：01 基本原则｜5分钟；02 宿舍误区｜17分钟；03 安全用药｜8分钟；04 选择挑战｜5分钟</w:t>
+      </w:r>
+    </w:p>
+    <w:p>
+      <w:r>
+        <w:t>底部关键句：全程约35分钟，已包含举手互动。</w:t>
+      </w:r>
+    </w:p>
+    <w:p>
+      <w:r>
+        <w:t>视觉：四段路线卡各配一张校园、药房或医疗空间的真实照片。；另嵌入真实照片：college-campus.jpg、pharmacy-01.jpg、pharmacy-02.jpg、hospital-02.jpg</w:t>
+      </w:r>
+    </w:p>
+    <w:p>
+      <w:r>
+        <w:t>分工与时间：甲，45秒。依据：原创课堂组织 / 综合归纳。</w:t>
+      </w:r>
+    </w:p>
+    <w:p>
+      <w:pPr>
+        <w:pStyle w:val="Heading2"/>
+      </w:pPr>
+      <w:r>
+        <w:t>03｜室友感冒了，你先做哪一步？</w:t>
+      </w:r>
+    </w:p>
+    <w:p>
+      <w:r>
+        <w:t>页面短文案：A 用上次的剩药，沿用当时吃法；B 拍清楚药盒，先核对再作决定；C 按最主要症状，先挑一盒试试</w:t>
       </w:r>
     </w:p>
     <w:p>
@@ -470,7 +498,7 @@
     </w:p>
     <w:p>
       <w:r>
-        <w:t>视觉：三条横向选择卡；右侧为手持药片的真实照片。；另嵌入真实照片：tablet-hand.jpg</w:t>
+        <w:t>视觉：等权选择卡与小苏思考漫画；题面明确单选或多选；不按答案区别格式。</w:t>
       </w:r>
     </w:p>
     <w:p>
@@ -483,7 +511,7 @@
         <w:pStyle w:val="Heading2"/>
       </w:pPr>
       <w:r>
-        <w:t>03｜合理用药，要同时过四关</w:t>
+        <w:t>04｜合理用药，要同时过四关</w:t>
       </w:r>
     </w:p>
     <w:p>
@@ -511,22 +539,22 @@
         <w:pStyle w:val="Heading2"/>
       </w:pPr>
       <w:r>
-        <w:t>04｜高中生物连接：药物也要找“靶点”</w:t>
+        <w:t>05｜鼻子舒服了，为什么上课却犯困？</w:t>
       </w:r>
     </w:p>
     <w:p>
       <w:r>
-        <w:t>页面短文案：受体：接收信号的蛋白质；酶：参与并催化化学反应；药物：可能改变信号或反应过程</w:t>
+        <w:t>页面短文案：鼻部｜组胺参与部分过敏反应；脑内｜组胺信号也参与维持清醒；用药前｜查嗜睡提示，说清上课与通勤需求</w:t>
       </w:r>
     </w:p>
     <w:p>
       <w:r>
-        <w:t>底部关键句：结构与功能有关｜靶点也可能分布在多个部位</w:t>
+        <w:t>底部关键句：症状缓解，不代表没有其他影响｜先查嗜睡提示</w:t>
       </w:r>
     </w:p>
     <w:p>
       <w:r>
-        <w:t>视觉：可编辑“药物—受体—信号”示意，标注简化模型、非比例。</w:t>
+        <w:t>视觉：以同一位小苏的两幅场景开场：左侧鼻子舒服、停止擦鼻涕，右侧课堂托腮、眼皮下垂；中间用简化人体轮廓标出鼻部与脑部，分别连接“过敏反应”和“维持清醒”。标注“部分抗组胺药可能进入脑内”，用提示框收束到“查嗜睡提示”。不使用胶囊—六边形—圆点的抽象匹配图；图示为简化机制，不表示所有药物都会致困。</w:t>
       </w:r>
     </w:p>
     <w:p>
@@ -539,40 +567,12 @@
         <w:pStyle w:val="Heading2"/>
       </w:pPr>
       <w:r>
-        <w:t>05｜今天的路线：从会判断，到会行动</w:t>
+        <w:t>06｜两盒药，是“双保险”还是撞车？</w:t>
       </w:r>
     </w:p>
     <w:p>
       <w:r>
-        <w:t>页面短文案：01 基本原则｜5分钟；02 宿舍误区｜17分钟；03 安全用药｜8分钟；04 选择挑战｜5分钟</w:t>
-      </w:r>
-    </w:p>
-    <w:p>
-      <w:r>
-        <w:t>底部关键句：全程约35分钟，已包含举手互动。</w:t>
-      </w:r>
-    </w:p>
-    <w:p>
-      <w:r>
-        <w:t>视觉：四段路线卡各配一张校园、药房或医疗空间的真实照片。；另嵌入真实照片：college-campus.jpg、pharmacy-01.jpg、pharmacy-02.jpg、hospital-02.jpg</w:t>
-      </w:r>
-    </w:p>
-    <w:p>
-      <w:r>
-        <w:t>分工与时间：甲，45秒。依据：原创课堂组织 / 综合归纳。</w:t>
-      </w:r>
-    </w:p>
-    <w:p>
-      <w:pPr>
-        <w:pStyle w:val="Heading2"/>
-      </w:pPr>
-      <w:r>
-        <w:t>06｜案例①：两盒感冒药，真是“双保险”？</w:t>
-      </w:r>
-    </w:p>
-    <w:p>
-      <w:r>
-        <w:t>页面短文案：小苏：一盒治头痛，一盒治感冒；室友：名字不同，应该能一起吃？；先暂停：翻到“成分”一栏</w:t>
+        <w:t>页面短文案：情境｜头痛还在，要不再加一盒？；对话｜名字不同，应该不重复吧？；悬念｜药盒不同，里面的成分呢？</w:t>
       </w:r>
     </w:p>
     <w:p>
@@ -582,7 +582,7 @@
     </w:p>
     <w:p>
       <w:r>
-        <w:t>视觉：药瓶实拍照片配三条情境线索；照片不对应虚构故事。；另嵌入真实照片：pill-bottle.jpg</w:t>
+        <w:t>视觉：三格彩色漫画：小苏拿第二盒药、室友用气泡解释、成分栏放大并留下问号。角色统一，每格只留一句。</w:t>
       </w:r>
     </w:p>
     <w:p>
@@ -595,22 +595,22 @@
         <w:pStyle w:val="Heading2"/>
       </w:pPr>
       <w:r>
-        <w:t>07｜看成分，才能发现“隐形重复”</w:t>
+        <w:t>07｜药盒不同，成分可能“撞车”</w:t>
       </w:r>
     </w:p>
     <w:p>
       <w:r>
-        <w:t>页面短文案：药盒A｜对乙酰氨基酚；药盒B｜对乙酰氨基酚＋其他成分；同一成分，会从不同药盒汇合</w:t>
+        <w:t>页面短文案：药盒A｜单方：对乙酰氨基酚；药盒B｜复方：对乙酰氨基酚＋马来酸氯苯那敏＋盐酸伪麻黄碱；先圈同名成分，再核规格、时间和已服药物</w:t>
       </w:r>
     </w:p>
     <w:p>
       <w:r>
-        <w:t>底部关键句：通用名 / 成分优先于商品名｜示意标签，不是实际说明书</w:t>
+        <w:t>底部关键句：同名成分出现两次，是暂停核对的信号｜未确认前不自行叠加</w:t>
       </w:r>
     </w:p>
     <w:p>
       <w:r>
-        <w:t>视觉：两张可编辑药盒成分标签，红框突出同名成分，箭头汇合。</w:t>
+        <w:t>视觉：两盒不同配色的教学药盒。重复成分都用红色且完整命名；另两种成分用青绿和紫色，汇合箭头突出同一成分来自两盒，再给出圈重复、核信息、再决定的动作。</w:t>
       </w:r>
     </w:p>
     <w:p>
@@ -623,27 +623,27 @@
         <w:pStyle w:val="Heading2"/>
       </w:pPr>
       <w:r>
-        <w:t>08｜真实研究：模拟用药，也容易出错</w:t>
+        <w:t>08｜18点吃过药，20点还痛：先补哪条信息？</w:t>
       </w:r>
     </w:p>
     <w:p>
       <w:r>
-        <w:t>页面短文案：23.8%｜单一产品模拟用量超标；45.6%｜模拟联用出现重复超量</w:t>
+        <w:t>页面短文案：18:00｜已经服过一种复方感冒药；20:00｜症状还在，准备加一盒退热药；信息缺口｜成分、规格、已服用量还没核对</w:t>
       </w:r>
     </w:p>
     <w:p>
       <w:r>
-        <w:t>底部关键句：两项指标可能重叠，不能相加；不是实际中毒率。</w:t>
+        <w:t>底部关键句：时间只是故事线索，不是推荐给药间隔｜先补信息，不凭感觉加药</w:t>
       </w:r>
     </w:p>
     <w:p>
       <w:r>
-        <w:t>视觉：PowerPoint原生可编辑水平条形图，0—100%；标出美国、n=500、2012。</w:t>
+        <w:t>视觉：漫画时间线：已服药记录、第二个药盒、末端放大的信息清单；橙色突出想加药，青绿突出先补信息，不出现推荐剂量或等待时长。</w:t>
       </w:r>
     </w:p>
     <w:p>
       <w:r>
-        <w:t>分工与时间：甲，60秒。依据：S3。</w:t>
+        <w:t>分工与时间：甲，60秒。依据：S2。</w:t>
       </w:r>
     </w:p>
     <w:p>
@@ -651,22 +651,22 @@
         <w:pStyle w:val="Heading2"/>
       </w:pPr>
       <w:r>
-        <w:t>09｜选择题②：两盒都含相同成分，怎么办？</w:t>
+        <w:t>09｜室友群的三条消息，你给哪条点赞？</w:t>
       </w:r>
     </w:p>
     <w:p>
       <w:r>
-        <w:t>页面短文案：A 商品名不同，可以照常同服；B 两种各减一半，自己调一调；C 暂不叠加，核对说明书并问药师</w:t>
+        <w:t>页面短文案：A 拍下两盒成分，圈出相同的名字；B 按症状拆开安排，把服药时间错开；C 补上今天已服药名、规格与时间</w:t>
       </w:r>
     </w:p>
     <w:p>
       <w:r>
-        <w:t>底部关键句：请选最稳妥的下一步｜答案在下一页</w:t>
+        <w:t>底部关键句：可多选 A / B / C｜哪些建议先帮我们补齐判断所需的信息？</w:t>
       </w:r>
     </w:p>
     <w:p>
       <w:r>
-        <w:t>视觉：三选一卡片右侧配药瓶实拍照片。；另嵌入真实照片：pill-bottle.jpg</w:t>
+        <w:t>视觉：等权选择卡与小苏思考漫画；题面明确单选或多选；不按答案区别格式。</w:t>
       </w:r>
     </w:p>
     <w:p>
@@ -679,17 +679,17 @@
         <w:pStyle w:val="Heading2"/>
       </w:pPr>
       <w:r>
-        <w:t>10｜答案 C：先核对，再决定</w:t>
+        <w:t>10｜答案 A＋C：先把两类信息凑齐</w:t>
       </w:r>
     </w:p>
     <w:p>
       <w:r>
-        <w:t>页面短文案：同成分：先不自行叠加；规格、时间、已服药物：一起核对；拿不准：带包装或照片问药师</w:t>
+        <w:t>页面短文案：A 圈出同名成分，发现可能重复；C 补规格和已服记录，核对累计使用；B 错开时间，仍不能代替完整核对</w:t>
       </w:r>
     </w:p>
     <w:p>
       <w:r>
-        <w:t>底部关键句：少猜一步，就少一个出错机会。</w:t>
+        <w:t>底部关键句：同成分先不自行叠加；拿着完整信息，再核实下一步。</w:t>
       </w:r>
     </w:p>
     <w:p>
@@ -722,7 +722,7 @@
     </w:p>
     <w:p>
       <w:r>
-        <w:t>视觉：原创细菌与病毒矢量插画；清楚标注细胞壁为部分抗生素靶点。</w:t>
+        <w:t>视觉：彩色显微世界插画：青绿细菌有细胞结构与遗传物质；紫色病毒有外壳与遗传物质，连接宿主细胞。用文字说明抗生素针对某些细菌结构或过程；示意不按比例。</w:t>
       </w:r>
     </w:p>
     <w:p>
@@ -763,22 +763,22 @@
         <w:pStyle w:val="Heading2"/>
       </w:pPr>
       <w:r>
-        <w:t>13｜耐药风险，有多大？看清数据口径</w:t>
+        <w:t>13｜495万与127万：是在回答两个问题</w:t>
       </w:r>
     </w:p>
     <w:p>
       <w:r>
-        <w:t>页面短文案：495万｜与细菌耐药相关的死亡；127万｜归因于细菌耐药的死亡</w:t>
+        <w:t>页面短文案：相关死亡｜假设这类耐药感染没有发生；归因死亡｜感染仍发生，但细菌对药物敏感；同一负担的两种比较，不是可以相加的两组人</w:t>
       </w:r>
     </w:p>
     <w:p>
       <w:r>
-        <w:t>底部关键句：2019年全球估计｜两种口径，不可相加。</w:t>
+        <w:t>底部关键句：2019年全球模型估计｜不能相加，也不能全部归咎于个人乱用药</w:t>
       </w:r>
     </w:p>
     <w:p>
       <w:r>
-        <w:t>视觉：带95%不确定性区间的水平条形图；单位万人，轴从0起；注明数据年2019、发表年2022。</w:t>
+        <w:t>视觉：左侧两种假设解释卡；右侧共同0—700万人刻度的独立条形。青绿为相关死亡，紫色为归因死亡，均带文字图例、估计点和95%不确定性区间；不堆叠，不画成互斥类别。</w:t>
       </w:r>
     </w:p>
     <w:p>
@@ -819,22 +819,22 @@
         <w:pStyle w:val="Heading2"/>
       </w:pPr>
       <w:r>
-        <w:t>15｜案例③：“备考外挂”，真的值得试？</w:t>
+        <w:t>15｜考试周的“外挂”，谁在给它背书？</w:t>
       </w:r>
     </w:p>
     <w:p>
       <w:r>
-        <w:t>页面短文案：保健食品｜不能代替药物治疗疾病；“提高考试成绩”｜警惕夸大宣传；处方兴奋剂｜不借药、不自行购买服用</w:t>
+        <w:t>页面短文案：情境｜今晚要复习，广告说能快速提分；对话｜别人用的处方药，要不要试？；悬念｜宣传和别人经验，能替代适用依据吗？</w:t>
       </w:r>
     </w:p>
     <w:p>
       <w:r>
-        <w:t>底部关键句：清醒感，不等于学习效果的保证。</w:t>
+        <w:t>底部关键句：清醒感不等于成绩保证；保健食品与处方药都不能靠传闻判断。</w:t>
       </w:r>
     </w:p>
     <w:p>
       <w:r>
-        <w:t>视觉：校园学生实拍照片配备考产品的三项判断。；另嵌入真实照片：college-campus.jpg</w:t>
+        <w:t>视觉：三格漫画：书桌前刷到夸张提分广告、室友递匿名药盒、处方适用信息变成问号。橙黄与紫色活泼配色，广告用小爆炸贴纸，不展示品牌。</w:t>
       </w:r>
     </w:p>
     <w:p>
@@ -875,7 +875,7 @@
         <w:pStyle w:val="Heading2"/>
       </w:pPr>
       <w:r>
-        <w:t>17｜同一条信号，在不同部位有不同作用</w:t>
+        <w:t>17｜同一种组胺信号，为什么有两种影响？</w:t>
       </w:r>
     </w:p>
     <w:p>
@@ -890,7 +890,7 @@
     </w:p>
     <w:p>
       <w:r>
-        <w:t>视觉：外周与脑内双路径示意；受体、箭头及说明可编辑。</w:t>
+        <w:t>视觉：鼻部青绿、脑部紫色的双路径机制漫画。橙色组胺、H1受体明确命名；脑部单独画血脑屏障闸门并注明部分药物可进入，连接小苏的清醒与困倦表情。</w:t>
       </w:r>
     </w:p>
     <w:p>
@@ -931,12 +931,12 @@
         <w:pStyle w:val="Heading2"/>
       </w:pPr>
       <w:r>
-        <w:t>19｜选择题③：聚餐前，选哪条路线？</w:t>
+        <w:t>19｜聚餐群里的建议，哪条先解决未知？</w:t>
       </w:r>
     </w:p>
     <w:p>
       <w:r>
-        <w:t>页面短文案：A 已经吃过药，统一等两小时再喝酒；B 看具体药品要求；拿不准就先不喝；C 只要不醉，就不会与药物相互作用</w:t>
+        <w:t>页面短文案：A 先吃点东西，把两者错开两小时；B 照以前的经验，只小酌不碰烈酒；C 今晚先换白水，按具体药名查要求</w:t>
       </w:r>
     </w:p>
     <w:p>
@@ -946,7 +946,7 @@
     </w:p>
     <w:p>
       <w:r>
-        <w:t>视觉：三选一卡片右侧配药房实拍照片。；另嵌入真实照片：pharmacy-03.jpg</w:t>
+        <w:t>视觉：等权选择卡与小苏思考漫画；题面明确单选或多选；不按答案区别格式。</w:t>
       </w:r>
     </w:p>
     <w:p>
@@ -969,7 +969,7 @@
     </w:p>
     <w:p>
       <w:r>
-        <w:t>底部关键句：上一题选 B｜把“不确定”变成一个咨询动作。</w:t>
+        <w:t>底部关键句：上一题选 C｜把“不确定”变成一个咨询动作。</w:t>
       </w:r>
     </w:p>
     <w:p>
@@ -1183,22 +1183,22 @@
         <w:pStyle w:val="Heading2"/>
       </w:pPr>
       <w:r>
-        <w:t>28｜你会替小苏选哪个方案？</w:t>
+        <w:t>28｜小苏的晚间计划，你采纳哪几条？</w:t>
       </w:r>
     </w:p>
     <w:p>
       <w:r>
-        <w:t>页面短文案：A 两盒一起吃，聚餐少喝一点；B 先核对成分，拿不准问药师；先不喝酒；C 加抗生素预防一下，明天再看</w:t>
+        <w:t>页面短文案：A 聚餐先点白水，具体饮酒要求再查；B 药盒和已服记录，一起交给药师核对；C 照上次的经验，把第二盒改到睡前</w:t>
       </w:r>
     </w:p>
     <w:p>
       <w:r>
-        <w:t>底部关键句：单选 A / B / C｜想10秒，然后举手</w:t>
+        <w:t>底部关键句：可多选 A / B / C｜逐条判断；想10秒，再举手</w:t>
       </w:r>
     </w:p>
     <w:p>
       <w:r>
-        <w:t>视觉：三选一卡片右侧配药房实拍照片。；另嵌入真实照片：pharmacy-01.jpg</w:t>
+        <w:t>视觉：等权选择卡与小苏思考漫画；题面明确单选或多选；不按答案区别格式。</w:t>
       </w:r>
     </w:p>
     <w:p>
@@ -1211,12 +1211,12 @@
         <w:pStyle w:val="Heading2"/>
       </w:pPr>
       <w:r>
-        <w:t>29｜答案 B：三个判断点，全都用上了</w:t>
+        <w:t>29｜答案 A＋B：把建议拼成完整行动</w:t>
       </w:r>
     </w:p>
     <w:p>
       <w:r>
-        <w:t>页面短文案：成分未核对 → 先不自行叠加；饮酒要求不明 → 先不喝，查询确认；没有用药依据 → 不自行加抗生素</w:t>
+        <w:t>页面短文案：A 饮酒要求未明 → 先用白水，再查询；B 药盒与已服记录 → 一起核对，再决定；C 沿用经验错开时间 → 信息缺口仍在</w:t>
       </w:r>
     </w:p>
     <w:p>
@@ -1272,12 +1272,12 @@
     </w:p>
     <w:p>
       <w:r>
-        <w:t>图1（第8页）：Wolf等，2012年，500名美国成人门诊参与者，模拟非处方对乙酰氨基酚用药任务。单一产品任务中23.8%安排出24小时超过4克的用量；联用任务中45.6%出现重复成分造成的潜在超量。4克为该研究的判定口径，不是本课给出的用药建议，也不能代替中国具体药品说明书的限量。两指标可能重叠，不相加；不能解释为实际中毒、肝损伤或中国大学生发生率。原始数值保留一位小数，条形轴从0至100%。</w:t>
+        <w:t>第8页为虚构宿舍用药案例，不再展示模拟超量研究比例。18点与20点只作故事时间线，不是给药间隔；核对具体药名、成分、规格与已服时间和用量。依据S2。</w:t>
       </w:r>
     </w:p>
     <w:p>
       <w:r>
-        <w:t>图2（第13页）：Antimicrobial Resistance Collaborators，Lancet 2022；数据年2019，全球细菌耐药负担模型估计。相关死亡495万人（95%不确定性区间362—657万人）；归因死亡127万人（91.1—171万人）。相关口径以无耐药感染为反事实，归因口径以药物敏感感染替代耐药感染为反事实。不是两个人群可以相加，也不表示这些死亡均由个人滥用抗生素造成。没有把2019年数据写成当前最新数据。</w:t>
+        <w:t>图表（第13页）：Antimicrobial Resistance Collaborators，Lancet 2022；数据年2019，全球细菌耐药负担模型估计。相关死亡495万人（95%不确定性区间362—657万人）；归因死亡127万人（91.1—171万人）。相关口径以无耐药感染为反事实，归因口径以药物敏感感染替代耐药感染为反事实。不是两个人群可以相加，也不表示这些死亡均由个人滥用抗生素造成。没有把2019年数据写成当前最新数据。</w:t>
       </w:r>
     </w:p>
     <w:p>
@@ -1385,7 +1385,7 @@
           </w:tcPr>
           <w:p>
             <w:r>
-              <w:t>后排能读到主体文字；三色统一；图形无遮挡；不直接念参考文献。</w:t>
+              <w:t>后排能读到主体文字；蓝红白主色配青绿、紫色、橙黄点缀；图形无遮挡；不直接念参考文献。</w:t>
             </w:r>
           </w:p>
         </w:tc>
@@ -1792,7 +1792,7 @@
     </w:p>
     <w:p>
       <w:r>
-        <w:t>检索日期：2026-10-09。网页更新时间可能改变；论文数值按上述固定发表版本使用。全文由课堂语言转述，未照搬整段原文或未授权品牌图像。</w:t>
+        <w:t>原始资料检索：2026-10-09；版面及题目修订：2026-10-12。网页更新时间可能改变；论文数值按上述固定发表版本使用。全文由课堂语言转述，未照搬整段原文或未授权品牌图像。</w:t>
       </w:r>
     </w:p>
     <w:sectPr>

</xml_diff>

<commit_message>
deliver: synchronize current page mapping and design guide
</commit_message>
<xml_diff>
--- a/交付文件/合理用药_大纲与逐页设计说明.docx
+++ b/交付文件/合理用药_大纲与逐页设计说明.docx
@@ -118,7 +118,7 @@
           </w:tcPr>
           <w:p>
             <w:r>
-              <w:t>12页主讲页保留9张图库照片；两页情境改为三格原创漫画，机制图和成分示意均为可编辑形状。</w:t>
+              <w:t>9页主讲保留7张实际使用的图库照片；情境采用三格漫画与课堂困倦场景，机制图和成分示意均为可编辑形状。</w:t>
             </w:r>
           </w:p>
         </w:tc>
@@ -140,7 +140,7 @@
           </w:tcPr>
           <w:p>
             <w:r>
-              <w:t>第8页为宿舍用药信息核对案例；第13页为同一刻度的两条独立估计，含95%不确定性区间。</w:t>
+              <w:t>第8页为宿舍用药信息核对案例；第12页为100格处方比例与1至最高10倍风险示意，明确两个不同口径。</w:t>
             </w:r>
           </w:p>
         </w:tc>
@@ -206,7 +206,7 @@
           </w:tcPr>
           <w:p>
             <w:r>
-              <w:t>从用药现象引出信号传递；细菌和病毒；变异与自然选择；组胺双路径。</w:t>
+              <w:t>从用药现象引出信号传递；细菌和病毒；组胺双路径。</w:t>
             </w:r>
           </w:p>
         </w:tc>
@@ -334,7 +334,7 @@
           </w:tcPr>
           <w:p>
             <w:r>
-              <w:t>6—19</w:t>
+              <w:t>6—17</w:t>
             </w:r>
           </w:p>
         </w:tc>
@@ -344,7 +344,7 @@
           </w:tcPr>
           <w:p>
             <w:r>
-              <w:t>重复成分；已服药信息核对；抗生素与耐药负担图；备考产品；抗过敏嗜睡；酒精相互作用。</w:t>
+              <w:t>重复成分；已服药信息核对；抗生素不必要处方及感染风险；抗过敏嗜睡；先投票后聚餐案例。</w:t>
             </w:r>
           </w:p>
         </w:tc>
@@ -366,7 +366,7 @@
           </w:tcPr>
           <w:p>
             <w:r>
-              <w:t>20—26</w:t>
+              <w:t>18—24</w:t>
             </w:r>
           </w:p>
         </w:tc>
@@ -398,7 +398,7 @@
           </w:tcPr>
           <w:p>
             <w:r>
-              <w:t>27—30</w:t>
+              <w:t>25—28</w:t>
             </w:r>
           </w:p>
         </w:tc>
@@ -735,27 +735,27 @@
         <w:pStyle w:val="Heading2"/>
       </w:pPr>
       <w:r>
-        <w:t>12｜耐药：被筛选出来的是细菌</w:t>
+        <w:t>12｜不需要的抗生素，也可能带来真实伤害</w:t>
       </w:r>
     </w:p>
     <w:p>
       <w:r>
-        <w:t>页面短文案：原有差异｜少数细菌具有耐药性；选择压力｜敏感细菌更易被抑制；存活与繁殖｜耐药菌比例可能上升</w:t>
+        <w:t>页面短文案：至少28%｜美国门诊抗生素处方被估计为不必要；最高10倍｜用药期间及结束后1个月，艰难梭菌感染风险可升高；没有预期获益的用药，也会暴露于不良反应风险</w:t>
       </w:r>
     </w:p>
     <w:p>
       <w:r>
-        <w:t>底部关键句：连接高中生物：变异＋选择｜不是“人吃出了耐药体质”。</w:t>
+        <w:t>底部关键句：28%是处方比例，10倍是风险上限说明；口径不同，不能相乘或推算个人概率。</w:t>
       </w:r>
     </w:p>
     <w:p>
       <w:r>
-        <w:t>视觉：三阶段细菌群落示意；红色耐药菌数量标注为概念模型，不作真实比例。</w:t>
+        <w:t>视觉：蓝与珊瑚红的双图：左侧100格中28格高亮并注明美国门诊2014—2015估计；右侧共同0—10刻度的基准1与最高10倍相对风险示意。注明CDC所述用药期间及结束后1个月，不画成10%的发生率。</w:t>
       </w:r>
     </w:p>
     <w:p>
       <w:r>
-        <w:t>分工与时间：甲，80秒。依据：S4; S5。</w:t>
+        <w:t>分工与时间：甲，110秒。依据：S5; S15; S16。</w:t>
       </w:r>
     </w:p>
     <w:p>
@@ -763,27 +763,27 @@
         <w:pStyle w:val="Heading2"/>
       </w:pPr>
       <w:r>
-        <w:t>13｜495万与127万：是在回答两个问题</w:t>
+        <w:t>13｜把“别乱吃抗生素”，换成三个动作</w:t>
       </w:r>
     </w:p>
     <w:p>
       <w:r>
-        <w:t>页面短文案：相关死亡｜假设这类耐药感染没有发生；归因死亡｜感染仍发生，但细菌对药物敏感；同一负担的两种比较，不是可以相加的两组人</w:t>
+        <w:t>页面短文案：先确认需要｜感冒症状，不自动等于要用抗生素；不接室友剩药｜相似症状，不代表同一病因；按处方执行｜疗效或反应有疑问，及时咨询</w:t>
       </w:r>
     </w:p>
     <w:p>
       <w:r>
-        <w:t>底部关键句：2019年全球模型估计｜不能相加，也不能全部归咎于个人乱用药</w:t>
+        <w:t>底部关键句：先确认需要，再按具体处方使用；有疑问及时联系医生或药师。</w:t>
       </w:r>
     </w:p>
     <w:p>
       <w:r>
-        <w:t>视觉：左侧两种假设解释卡；右侧共同0—700万人刻度的独立条形。青绿为相关死亡，紫色为归因死亡，均带文字图例、估计点和95%不确定性区间；不堆叠，不画成互斥类别。</w:t>
+        <w:t>视觉：浅蓝底的三张动作卡，统一蓝与珊瑚红；放大镜核对、室友药盒暂停、处方清单咨询三幅原创图标，短标题与一行解释分层。</w:t>
       </w:r>
     </w:p>
     <w:p>
       <w:r>
-        <w:t>分工与时间：甲，70秒。依据：S5。</w:t>
+        <w:t>分工与时间：甲，80秒。依据：S4。</w:t>
       </w:r>
     </w:p>
     <w:p>
@@ -791,27 +791,27 @@
         <w:pStyle w:val="Heading2"/>
       </w:pPr>
       <w:r>
-        <w:t>14｜抗生素的三条行动规则</w:t>
+        <w:t>14｜案例③：鼻子舒服了，上课却困了</w:t>
       </w:r>
     </w:p>
     <w:p>
       <w:r>
-        <w:t>页面短文案：不自行启用｜先明确是否需要；不分享剩药｜相似症状不等于相同病因；按处方使用｜不擅自停、加或延长</w:t>
+        <w:t>页面短文案：先查｜说明书中的嗜睡提示；再说｜白天有课、需要通勤等需求；已经困｜避开驾驶、骑车等高风险活动</w:t>
       </w:r>
     </w:p>
     <w:p>
       <w:r>
-        <w:t>底部关键句：出现不良反应或疗效疑问，及时联系医生 / 药师。</w:t>
+        <w:t>底部关键句：“较少嗜睡”不等于人人不困；第一次使用时尤其留意个人反应。</w:t>
       </w:r>
     </w:p>
     <w:p>
       <w:r>
-        <w:t>视觉：三条抗生素行动规则分别配药房、药师及药瓶实拍照片。；另嵌入真实照片：pharmacy-03.jpg、pharmacy-02.jpg、pill-bottle.jpg</w:t>
+        <w:t>视觉：左侧放大小苏课堂犯困的表情与书桌场景；右侧浅蓝底三张短句提示卡。用同一角色与统一色调，代替无关夜景照片。</w:t>
       </w:r>
     </w:p>
     <w:p>
       <w:r>
-        <w:t>分工与时间：甲，55秒。依据：S4。</w:t>
+        <w:t>分工与时间：甲，90秒。依据：S8。</w:t>
       </w:r>
     </w:p>
     <w:p>
@@ -819,63 +819,7 @@
         <w:pStyle w:val="Heading2"/>
       </w:pPr>
       <w:r>
-        <w:t>15｜考试周的“外挂”，谁在给它背书？</w:t>
-      </w:r>
-    </w:p>
-    <w:p>
-      <w:r>
-        <w:t>页面短文案：情境｜今晚要复习，广告说能快速提分；对话｜别人用的处方药，要不要试？；悬念｜宣传和别人经验，能替代适用依据吗？</w:t>
-      </w:r>
-    </w:p>
-    <w:p>
-      <w:r>
-        <w:t>底部关键句：清醒感不等于成绩保证；保健食品与处方药都不能靠传闻判断。</w:t>
-      </w:r>
-    </w:p>
-    <w:p>
-      <w:r>
-        <w:t>视觉：三格漫画：书桌前刷到夸张提分广告、室友递匿名药盒、处方适用信息变成问号。橙黄与紫色活泼配色，广告用小爆炸贴纸，不展示品牌。</w:t>
-      </w:r>
-    </w:p>
-    <w:p>
-      <w:r>
-        <w:t>分工与时间：甲，60秒。依据：S6; S7。</w:t>
-      </w:r>
-    </w:p>
-    <w:p>
-      <w:pPr>
-        <w:pStyle w:val="Heading2"/>
-      </w:pPr>
-      <w:r>
-        <w:t>16｜案例④：鼻子舒服了，上课却困了</w:t>
-      </w:r>
-    </w:p>
-    <w:p>
-      <w:r>
-        <w:t>页面短文案：部分抗组胺药｜可能引起嗜睡；“较少嗜睡”｜不代表人人都不困；困倦时｜避免驾驶、骑车等高风险活动</w:t>
-      </w:r>
-    </w:p>
-    <w:p>
-      <w:r>
-        <w:t>底部关键句：不能仅凭“抗过敏药”四个字判断影响。</w:t>
-      </w:r>
-    </w:p>
-    <w:p>
-      <w:r>
-        <w:t>视觉：夜间床头场景实拍照片配抗过敏药嗜睡提示。；另嵌入真实照片：evening.jpg</w:t>
-      </w:r>
-    </w:p>
-    <w:p>
-      <w:r>
-        <w:t>分工与时间：甲，75秒。依据：S8。</w:t>
-      </w:r>
-    </w:p>
-    <w:p>
-      <w:pPr>
-        <w:pStyle w:val="Heading2"/>
-      </w:pPr>
-      <w:r>
-        <w:t>17｜同一种组胺信号，为什么有两种影响？</w:t>
+        <w:t>15｜同一种组胺信号，为什么有两种影响？</w:t>
       </w:r>
     </w:p>
     <w:p>
@@ -903,35 +847,7 @@
         <w:pStyle w:val="Heading2"/>
       </w:pPr>
       <w:r>
-        <w:t>18｜案例⑤：聚餐的酒，先缓一缓</w:t>
-      </w:r>
-    </w:p>
-    <w:p>
-      <w:r>
-        <w:t>页面短文案：酒精＋部分抗过敏药｜嗜睡与反应受损风险增加；酒精＋某些药物｜可能增加其他不良反应风险；普通口服片剂 / 胶囊｜通常用白水，具体看说明书</w:t>
-      </w:r>
-    </w:p>
-    <w:p>
-      <w:r>
-        <w:t>底部关键句：拿不准能否饮酒：先不喝，再查说明书或问药师。</w:t>
-      </w:r>
-    </w:p>
-    <w:p>
-      <w:r>
-        <w:t>视觉：药瓶实拍照片配饮酒与服药的三项核对提示。；另嵌入真实照片：pill-bottle.jpg</w:t>
-      </w:r>
-    </w:p>
-    <w:p>
-      <w:r>
-        <w:t>分工与时间：乙，120秒。依据：S8; S9; S13。</w:t>
-      </w:r>
-    </w:p>
-    <w:p>
-      <w:pPr>
-        <w:pStyle w:val="Heading2"/>
-      </w:pPr>
-      <w:r>
-        <w:t>19｜聚餐群里的建议，哪条先解决未知？</w:t>
+        <w:t>16｜聚餐邀请到了，你先回哪条消息？</w:t>
       </w:r>
     </w:p>
     <w:p>
@@ -941,7 +857,7 @@
     </w:p>
     <w:p>
       <w:r>
-        <w:t>底部关键句：背景：今天服了抗过敏药，具体饮酒要求尚未确认。</w:t>
+        <w:t>底部关键句：单选｜今天服过抗过敏药，具体饮酒要求未确认；下一页再揭晓。</w:t>
       </w:r>
     </w:p>
     <w:p>
@@ -951,7 +867,7 @@
     </w:p>
     <w:p>
       <w:r>
-        <w:t>分工与时间：乙，120秒。依据：S8; S9。</w:t>
+        <w:t>分工与时间：乙，150秒。依据：S8; S9。</w:t>
       </w:r>
     </w:p>
     <w:p>
@@ -959,7 +875,35 @@
         <w:pStyle w:val="Heading2"/>
       </w:pPr>
       <w:r>
-        <w:t>20｜安全用药四步：看、核、问、记</w:t>
+        <w:t>17｜案例④：聚餐这杯酒，先停一下</w:t>
+      </w:r>
+    </w:p>
+    <w:p>
+      <w:r>
+        <w:t>页面短文案：白天｜已经服过抗过敏药；晚上｜室友劝：就喝一点，没事吧？；行动｜暂换白水，核实具体药品要求</w:t>
+      </w:r>
+    </w:p>
+    <w:p>
+      <w:r>
+        <w:t>底部关键句：刚才选 C：拿不准就先不喝；错开两小时、酒量好都不能代替核实。</w:t>
+      </w:r>
+    </w:p>
+    <w:p>
+      <w:r>
+        <w:t>视觉：三格聚餐漫画：白天服药记录、室友酒杯与劝酒气泡、白水及手机药名核实。蓝与珊瑚红为主，人物表情和杯子突出；页末给出C的行动含义。</w:t>
+      </w:r>
+    </w:p>
+    <w:p>
+      <w:r>
+        <w:t>分工与时间：乙，150秒。依据：S8; S9; S13。</w:t>
+      </w:r>
+    </w:p>
+    <w:p>
+      <w:pPr>
+        <w:pStyle w:val="Heading2"/>
+      </w:pPr>
+      <w:r>
+        <w:t>18｜安全用药四步：看、核、问、记</w:t>
       </w:r>
     </w:p>
     <w:p>
@@ -969,7 +913,7 @@
     </w:p>
     <w:p>
       <w:r>
-        <w:t>底部关键句：上一题选 C｜把“不确定”变成一个咨询动作。</w:t>
+        <w:t>底部关键句：刚才选 C｜把“不确定”变成一个咨询动作。</w:t>
       </w:r>
     </w:p>
     <w:p>
@@ -987,7 +931,7 @@
         <w:pStyle w:val="Heading2"/>
       </w:pPr>
       <w:r>
-        <w:t>21｜说明书很长？先定位这六处</w:t>
+        <w:t>19｜说明书很长？先定位这六处</w:t>
       </w:r>
     </w:p>
     <w:p>
@@ -1015,7 +959,7 @@
         <w:pStyle w:val="Heading2"/>
       </w:pPr>
       <w:r>
-        <w:t>22｜时间、剂量、剂型，都别凭感觉改</w:t>
+        <w:t>20｜时间、剂量、剂型，都别凭感觉改</w:t>
       </w:r>
     </w:p>
     <w:p>
@@ -1043,7 +987,7 @@
         <w:pStyle w:val="Heading2"/>
       </w:pPr>
       <w:r>
-        <w:t>23｜问药师时，把信息一次说清</w:t>
+        <w:t>21｜问药师时，把信息一次说清</w:t>
       </w:r>
     </w:p>
     <w:p>
@@ -1071,7 +1015,7 @@
         <w:pStyle w:val="Heading2"/>
       </w:pPr>
       <w:r>
-        <w:t>24｜什么时候，不该继续自己试药？</w:t>
+        <w:t>22｜什么时候，不该继续自己试药？</w:t>
       </w:r>
     </w:p>
     <w:p>
@@ -1099,7 +1043,7 @@
         <w:pStyle w:val="Heading2"/>
       </w:pPr>
       <w:r>
-        <w:t>25｜宿舍药箱：留信息，也留秩序</w:t>
+        <w:t>23｜宿舍药箱：留信息，也留秩序</w:t>
       </w:r>
     </w:p>
     <w:p>
@@ -1127,12 +1071,12 @@
         <w:pStyle w:val="Heading2"/>
       </w:pPr>
       <w:r>
-        <w:t>26｜把五个误区，换成五个动作</w:t>
+        <w:t>24｜把四个误区，换成四个动作</w:t>
       </w:r>
     </w:p>
     <w:p>
       <w:r>
-        <w:t>页面短文案：感冒药叠加 → 核对成分；感冒吃抗生素 → 先明确是否需要；备考“外挂” → 不借用处方药；抗过敏后困倦 → 查提示、避风险活动；吃药后聚餐 → 先确认饮酒要求</w:t>
+        <w:t>页面短文案：感冒药叠加 → 核对成分；感冒吃抗生素 → 先确认是否需要；抗过敏后困倦 → 查提示、避高风险活动；吃药后聚餐 → 先核实饮酒要求</w:t>
       </w:r>
     </w:p>
     <w:p>
@@ -1155,7 +1099,7 @@
         <w:pStyle w:val="Heading2"/>
       </w:pPr>
       <w:r>
-        <w:t>27｜综合挑战：小苏今晚怎么安排？</w:t>
+        <w:t>25｜综合挑战：小苏今晚怎么安排？</w:t>
       </w:r>
     </w:p>
     <w:p>
@@ -1183,7 +1127,7 @@
         <w:pStyle w:val="Heading2"/>
       </w:pPr>
       <w:r>
-        <w:t>28｜小苏的晚间计划，你采纳哪几条？</w:t>
+        <w:t>26｜小苏的晚间计划，你采纳哪几条？</w:t>
       </w:r>
     </w:p>
     <w:p>
@@ -1211,7 +1155,7 @@
         <w:pStyle w:val="Heading2"/>
       </w:pPr>
       <w:r>
-        <w:t>29｜答案 A＋B：把建议拼成完整行动</w:t>
+        <w:t>27｜答案 A＋B：把建议拼成完整行动</w:t>
       </w:r>
     </w:p>
     <w:p>
@@ -1239,7 +1183,7 @@
         <w:pStyle w:val="Heading2"/>
       </w:pPr>
       <w:r>
-        <w:t>30｜药可以常备，判断不能省略</w:t>
+        <w:t>28｜药可以常备，判断不能省略</w:t>
       </w:r>
     </w:p>
     <w:p>
@@ -1277,12 +1221,12 @@
     </w:p>
     <w:p>
       <w:r>
-        <w:t>图表（第13页）：Antimicrobial Resistance Collaborators，Lancet 2022；数据年2019，全球细菌耐药负担模型估计。相关死亡495万人（95%不确定性区间362—657万人）；归因死亡127万人（91.1—171万人）。相关口径以无耐药感染为反事实，归因口径以药物敏感感染替代耐药感染为反事实。不是两个人群可以相加，也不表示这些死亡均由个人滥用抗生素造成。没有把2019年数据写成当前最新数据。</w:t>
+        <w:t>第12页左图：CDC汇总美国门诊抗生素处方至少28%不必要，其所引Hersh等2021年论文该估计来自2014—2015年。100格只高亮28格，剩余格不表示全部合理，不把它当成中国或大学生发生率。右图：CDC About C. diff（2026年5月更新）指出用药期间及结束后1个月，艰难梭菌感染风险最高可达10倍。条形以1为比较基准，只展示最高风险倍数，不表示人人风险或绝对发生率。两图不同口径不能相乘。来源S5、S15、S16。</w:t>
       </w:r>
     </w:p>
     <w:p>
       <w:r>
-        <w:t>两组数据适合比较大小，因此采用条形图，而不是不适合当前数据结构的瀑布图。图表均按原文数据重绘并标注来源；没有直接截取论文整图。原始绘图数据另附CSV，便于更新。</w:t>
+        <w:t>处方比例采用100格图，风险倍数采用共用0—10刻度的条形示意；不同口径各自成图，不将两数混在同一数轴。原始数值、地域、时间窗与解释边界另附CSV。</w:t>
       </w:r>
     </w:p>
     <w:p>
@@ -1316,11 +1260,6 @@
     <w:p>
       <w:r>
         <w:t>问：能不能给个统一剂量或喝酒等待时长？答：具体药物、规格、病情和个体情况不同，不能给出统一值；看实际说明书和专业建议。</w:t>
-      </w:r>
-    </w:p>
-    <w:p>
-      <w:r>
-        <w:t>问：耐药是不是身体对药适应了？答：此处讨论的是细菌对抗菌药物的抵抗能力，不是人的身体产生所谓耐药体质。</w:t>
       </w:r>
     </w:p>
     <w:p>
@@ -1429,7 +1368,7 @@
           </w:tcPr>
           <w:p>
             <w:r>
-              <w:t>四部分完整；五类案例齐全；原则、机制和行动互相对应。</w:t>
+              <w:t>四部分完整；四类案例齐全；原则、机制和行动互相对应。</w:t>
             </w:r>
           </w:p>
         </w:tc>
@@ -1515,19 +1454,6 @@
     </w:p>
     <w:p>
       <w:r>
-        <w:t>[S3] Wolf MS, et al. Risk of Unintentional Overdose with Non-Prescription Acetaminophen Products. J Gen Intern Med. 2012;27:1587–1593. DOI: 10.1007/s11606-012-2096-3.</w:t>
-      </w:r>
-    </w:p>
-    <w:p>
-      <w:pPr>
-        <w:spacing w:after="200"/>
-      </w:pPr>
-      <w:r>
-        <w:t>https://pmc.ncbi.nlm.nih.gov/articles/PMC3509295/</w:t>
-      </w:r>
-    </w:p>
-    <w:p>
-      <w:r>
         <w:t>[S4] CDC. Healthy Habits: Antibiotic Do’s and Don’ts.</w:t>
       </w:r>
     </w:p>
@@ -1541,7 +1467,7 @@
     </w:p>
     <w:p>
       <w:r>
-        <w:t>[S5] Antimicrobial Resistance Collaborators. Global burden of bacterial antimicrobial resistance in 2019: a systematic analysis. Lancet. 2022;399:629–655. DOI: 10.1016/S0140-6736(21)02724-0.</w:t>
+        <w:t>[S5] CDC. Antibiotic Use in the United States（2025更新；门诊至少28%不必要处方）</w:t>
       </w:r>
     </w:p>
     <w:p>
@@ -1549,33 +1475,7 @@
         <w:spacing w:after="200"/>
       </w:pPr>
       <w:r>
-        <w:t>https://pmc.ncbi.nlm.nih.gov/articles/PMC8841637/</w:t>
-      </w:r>
-    </w:p>
-    <w:p>
-      <w:r>
-        <w:t>[S6] FDA（2023）Updating warnings to improve safe use of prescription stimulants used to treat ADHD and other conditions.</w:t>
-      </w:r>
-    </w:p>
-    <w:p>
-      <w:pPr>
-        <w:spacing w:after="200"/>
-      </w:pPr>
-      <w:r>
-        <w:t>https://www.fda.gov/drugs/drug-safety-communications/fda-updating-warnings-improve-safe-use-prescription-stimulants-used-treat-adhd-and-other-conditions</w:t>
-      </w:r>
-    </w:p>
-    <w:p>
-      <w:r>
-        <w:t>[S7] 市场监管总局《关于防范保健食品功能声称虚假宣传的消费提示》</w:t>
-      </w:r>
-    </w:p>
-    <w:p>
-      <w:pPr>
-        <w:spacing w:after="200"/>
-      </w:pPr>
-      <w:r>
-        <w:t>https://www.samr.gov.cn/xw/zj/art/2023/art_d03ccbcf0c7e482198c4adfa23f9e59a.html</w:t>
+        <w:t>https://www.cdc.gov/antibiotic-use/hcp/data-research/antibiotic-prescribing.html</w:t>
       </w:r>
     </w:p>
     <w:p>
@@ -1667,6 +1567,32 @@
       </w:pPr>
       <w:r>
         <w:t>https://pmc.ncbi.nlm.nih.gov/articles/PMC3650962/</w:t>
+      </w:r>
+    </w:p>
+    <w:p>
+      <w:r>
+        <w:t>[S15] CDC. About C. diff（2026更新；用药期间及结束后1个月感染风险最高10倍）</w:t>
+      </w:r>
+    </w:p>
+    <w:p>
+      <w:pPr>
+        <w:spacing w:after="200"/>
+      </w:pPr>
+      <w:r>
+        <w:t>https://www.cdc.gov/c-diff/about/</w:t>
+      </w:r>
+    </w:p>
+    <w:p>
+      <w:r>
+        <w:t>[S16] Hersh AL et al. Unnecessary Antibiotic Prescribing in US Ambulatory Care Settings, 2010–2015. Clin Infect Dis. 2021;72:133–137.</w:t>
+      </w:r>
+    </w:p>
+    <w:p>
+      <w:pPr>
+        <w:spacing w:after="200"/>
+      </w:pPr>
+      <w:r>
+        <w:t>https://stacks.cdc.gov/view/cdc/120299/cdc_120299_DS1.pdf</w:t>
       </w:r>
     </w:p>
     <w:p>
@@ -1792,7 +1718,7 @@
     </w:p>
     <w:p>
       <w:r>
-        <w:t>原始资料检索：2026-10-09；版面及题目修订：2026-10-12。网页更新时间可能改变；论文数值按上述固定发表版本使用。全文由课堂语言转述，未照搬整段原文或未授权品牌图像。</w:t>
+        <w:t>原始资料：2026-10-09；新增CDC数据核对与版面修订：2026-10-12。网页更新时间可能改变；论文数值按上述固定发表版本使用。全文由课堂语言转述，未照搬整段原文或未授权品牌图像。</w:t>
       </w:r>
     </w:p>
     <w:sectPr>

</xml_diff>

<commit_message>
deliver: refresh anime visual guide and editable caption instructions
</commit_message>
<xml_diff>
--- a/交付文件/合理用药_大纲与逐页设计说明.docx
+++ b/交付文件/合理用药_大纲与逐页设计说明.docx
@@ -118,7 +118,7 @@
           </w:tcPr>
           <w:p>
             <w:r>
-              <w:t>9页主讲保留7张实际使用的图库照片；情境采用三格漫画与课堂困倦场景，机制图和成分示意均为可编辑形状。</w:t>
+              <w:t>9页主讲保留7张实际使用的图库照片；情境采用原创动漫三格与课堂场景；对白可编辑，画面作为图片替换或裁切，机制图和成分示意均为可编辑形状。</w:t>
             </w:r>
           </w:p>
         </w:tc>
@@ -498,7 +498,7 @@
     </w:p>
     <w:p>
       <w:r>
-        <w:t>视觉：等权选择卡与小苏思考漫画；题面明确单选或多选；不按答案区别格式。</w:t>
+        <w:t>视觉：等权选择卡与小苏动漫肖像；仅保留单选或多选标记，不重复添加提示小标题；不按答案区别格式。</w:t>
       </w:r>
     </w:p>
     <w:p>
@@ -554,7 +554,7 @@
     </w:p>
     <w:p>
       <w:r>
-        <w:t>视觉：以同一位小苏的两幅场景开场：左侧鼻子舒服、停止擦鼻涕，右侧课堂托腮、眼皮下垂；中间用简化人体轮廓标出鼻部与脑部，分别连接“过敏反应”和“维持清醒”。标注“部分抗组胺药可能进入脑内”，用提示框收束到“查嗜睡提示”。不使用胶囊—六边形—圆点的抽象匹配图；图示为简化机制，不表示所有药物都会致困。</w:t>
+        <w:t>视觉：两幅同一角色的动漫分镜：鼻部症状缓解、课堂犯困；对白独立排版，图下保留简短机制说明，不重复设置场景小标题。</w:t>
       </w:r>
     </w:p>
     <w:p>
@@ -572,7 +572,7 @@
     </w:p>
     <w:p>
       <w:r>
-        <w:t>页面短文案：情境｜头痛还在，要不再加一盒？；对话｜名字不同，应该不重复吧？；悬念｜药盒不同，里面的成分呢？</w:t>
+        <w:t>页面短文案：头痛还在，要不再加一盒？；名字不同，应该不重复吧？；药盒不同，里面的成分呢？</w:t>
       </w:r>
     </w:p>
     <w:p>
@@ -582,7 +582,7 @@
     </w:p>
     <w:p>
       <w:r>
-        <w:t>视觉：三格彩色漫画：小苏拿第二盒药、室友用气泡解释、成分栏放大并留下问号。角色统一，每格只留一句。</w:t>
+        <w:t>视觉：宿舍核药动漫三格：头痛、室友递来第二盒药、两盒成分核对。删除情境、对话、悬念以及重复总结标题；独立对白可编辑。</w:t>
       </w:r>
     </w:p>
     <w:p>
@@ -638,7 +638,7 @@
     </w:p>
     <w:p>
       <w:r>
-        <w:t>视觉：漫画时间线：已服药记录、第二个药盒、末端放大的信息清单；橙色突出想加药，青绿突出先补信息，不出现推荐剂量或等待时长。</w:t>
+        <w:t>视觉：动漫核药时间线；仅保留实际18:00与20:00时间信息，图片下直接说明已服药、症状及核对信息，不叠加阶段名称。</w:t>
       </w:r>
     </w:p>
     <w:p>
@@ -666,7 +666,7 @@
     </w:p>
     <w:p>
       <w:r>
-        <w:t>视觉：等权选择卡与小苏思考漫画；题面明确单选或多选；不按答案区别格式。</w:t>
+        <w:t>视觉：等权选择卡与小苏动漫肖像；仅保留单选或多选标记，不重复添加提示小标题；不按答案区别格式。</w:t>
       </w:r>
     </w:p>
     <w:p>
@@ -796,7 +796,7 @@
     </w:p>
     <w:p>
       <w:r>
-        <w:t>页面短文案：先查｜说明书中的嗜睡提示；再说｜白天有课、需要通勤等需求；已经困｜避开驾驶、骑车等高风险活动</w:t>
+        <w:t>页面短文案：查看说明书中的嗜睡提示；告诉药师：白天有课、需要通勤；已经困倦时，避开驾驶或骑车</w:t>
       </w:r>
     </w:p>
     <w:p>
@@ -806,7 +806,7 @@
     </w:p>
     <w:p>
       <w:r>
-        <w:t>视觉：左侧放大小苏课堂犯困的表情与书桌场景；右侧浅蓝底三张短句提示卡。用同一角色与统一色调，代替无关夜景照片。</w:t>
+        <w:t>视觉：左侧为动漫课堂犯困分镜与一句对白；右侧为三个完整行动句，取消先查、再说等重复小标题。</w:t>
       </w:r>
     </w:p>
     <w:p>
@@ -834,7 +834,7 @@
     </w:p>
     <w:p>
       <w:r>
-        <w:t>视觉：鼻部青绿、脑部紫色的双路径机制漫画。橙色组胺、H1受体明确命名；脑部单独画血脑屏障闸门并注明部分药物可进入，连接小苏的清醒与困倦表情。</w:t>
+        <w:t>视觉：可编辑组胺双路径示意配原创动漫肖像；鼻部、脑内、H1受体及血脑屏障为必要机制标注，保留。</w:t>
       </w:r>
     </w:p>
     <w:p>
@@ -862,7 +862,7 @@
     </w:p>
     <w:p>
       <w:r>
-        <w:t>视觉：等权选择卡与小苏思考漫画；题面明确单选或多选；不按答案区别格式。</w:t>
+        <w:t>视觉：等权选择卡与小苏动漫肖像；仅保留单选或多选标记，不重复添加提示小标题；不按答案区别格式。</w:t>
       </w:r>
     </w:p>
     <w:p>
@@ -880,7 +880,7 @@
     </w:p>
     <w:p>
       <w:r>
-        <w:t>页面短文案：白天｜已经服过抗过敏药；晚上｜室友劝：就喝一点，没事吧？；行动｜暂换白水，核实具体药品要求</w:t>
+        <w:t>页面短文案：白天服过药，今晚聚餐怎么办？；室友：就喝一点，没事吧？；我先换白水，再核实这盒药的要求</w:t>
       </w:r>
     </w:p>
     <w:p>
@@ -890,7 +890,7 @@
     </w:p>
     <w:p>
       <w:r>
-        <w:t>视觉：三格聚餐漫画：白天服药记录、室友酒杯与劝酒气泡、白水及手机药名核实。蓝与珊瑚红为主，人物表情和杯子突出；页末给出C的行动含义。</w:t>
+        <w:t>视觉：原创动漫聚餐三格：记起已服药、室友劝酒、选白水并核实信息。取消白天、晚上、行动的独立标题和复述性短语，时间与行为直接写入对白。</w:t>
       </w:r>
     </w:p>
     <w:p>
@@ -1142,7 +1142,7 @@
     </w:p>
     <w:p>
       <w:r>
-        <w:t>视觉：等权选择卡与小苏思考漫画；题面明确单选或多选；不按答案区别格式。</w:t>
+        <w:t>视觉：等权选择卡与小苏动漫肖像；仅保留单选或多选标记，不重复添加提示小标题；不按答案区别格式。</w:t>
       </w:r>
     </w:p>
     <w:p>
@@ -1600,6 +1600,19 @@
         <w:pStyle w:val="Heading1"/>
       </w:pPr>
       <w:r>
+        <w:t>原创动漫素材</w:t>
+      </w:r>
+    </w:p>
+    <w:p>
+      <w:r>
+        <w:t>情境漫画使用2026-10-12生成的原创动漫分镜，统一小苏与室友形象，非真实学生或事件。宿舍核药、课堂困倦和聚餐场景均使用动漫画面；情境、对话、悬念等阶段标签已删除，仅保留实际时间与题型等必要信息。对白为可编辑PPT文字，图片可替换或裁切。原图和说明见source/assets/anime/。</w:t>
+      </w:r>
+    </w:p>
+    <w:p>
+      <w:pPr>
+        <w:pStyle w:val="Heading1"/>
+      </w:pPr>
+      <w:r>
         <w:t>真实照片来源与许可</w:t>
       </w:r>
     </w:p>

</xml_diff>

<commit_message>
deliver: update design guide and statistical scope
</commit_message>
<xml_diff>
--- a/交付文件/合理用药_大纲与逐页设计说明.docx
+++ b/交付文件/合理用药_大纲与逐页设计说明.docx
@@ -118,7 +118,7 @@
           </w:tcPr>
           <w:p>
             <w:r>
-              <w:t>9页主讲保留7张实际使用的图库照片；情境采用原创动漫三格与课堂场景；对白可编辑，画面作为图片替换或裁切，机制图和成分示意均为可编辑形状。</w:t>
+              <w:t>6页主讲使用6张各出现一次的图库照片；17幅不同动漫分镜各出现一次，情境、选择题和综合挑战均避免复用；对白可编辑，画面作为图片替换或裁切，机制图和成分示意均为可编辑形状。</w:t>
             </w:r>
           </w:p>
         </w:tc>
@@ -140,7 +140,7 @@
           </w:tcPr>
           <w:p>
             <w:r>
-              <w:t>第8页为宿舍用药信息核对案例；第12页为100格处方比例与1至最高10倍风险示意，明确两个不同口径。</w:t>
+              <w:t>第7页为宿舍用药信息核对案例；第11页为100格处方比例与五个急诊图标，呈现不必要处方及药物反应负担。</w:t>
             </w:r>
           </w:p>
         </w:tc>
@@ -302,7 +302,7 @@
           </w:tcPr>
           <w:p>
             <w:r>
-              <w:t>1—5</w:t>
+              <w:t>1—4</w:t>
             </w:r>
           </w:p>
         </w:tc>
@@ -334,7 +334,7 @@
           </w:tcPr>
           <w:p>
             <w:r>
-              <w:t>6—17</w:t>
+              <w:t>5—16</w:t>
             </w:r>
           </w:p>
         </w:tc>
@@ -366,7 +366,7 @@
           </w:tcPr>
           <w:p>
             <w:r>
-              <w:t>18—24</w:t>
+              <w:t>17—23</w:t>
             </w:r>
           </w:p>
         </w:tc>
@@ -398,7 +398,7 @@
           </w:tcPr>
           <w:p>
             <w:r>
-              <w:t>25—28</w:t>
+              <w:t>24—27</w:t>
             </w:r>
           </w:p>
         </w:tc>
@@ -470,7 +470,7 @@
     </w:p>
     <w:p>
       <w:r>
-        <w:t>视觉：四段路线卡各配一张校园、药房或医疗空间的真实照片。；另嵌入真实照片：college-campus.jpg、pharmacy-01.jpg、pharmacy-02.jpg、hospital-02.jpg</w:t>
+        <w:t>视觉：四段浅底色路线卡，分别用判断、宿舍药箱、安全步骤、选择挑战的可编辑图标呈现，不嵌入重复照片。</w:t>
       </w:r>
     </w:p>
     <w:p>
@@ -531,7 +531,7 @@
     </w:p>
     <w:p>
       <w:r>
-        <w:t>分工与时间：甲，60秒。依据：S1。</w:t>
+        <w:t>分工与时间：甲，120秒。依据：S1。</w:t>
       </w:r>
     </w:p>
     <w:p>
@@ -539,35 +539,7 @@
         <w:pStyle w:val="Heading2"/>
       </w:pPr>
       <w:r>
-        <w:t>05｜鼻子舒服了，为什么上课却犯困？</w:t>
-      </w:r>
-    </w:p>
-    <w:p>
-      <w:r>
-        <w:t>页面短文案：鼻部｜组胺参与部分过敏反应；脑内｜组胺信号也参与维持清醒；用药前｜查嗜睡提示，说清上课与通勤需求</w:t>
-      </w:r>
-    </w:p>
-    <w:p>
-      <w:r>
-        <w:t>底部关键句：症状缓解，不代表没有其他影响｜先查嗜睡提示</w:t>
-      </w:r>
-    </w:p>
-    <w:p>
-      <w:r>
-        <w:t>视觉：两幅同一角色的动漫分镜：鼻部症状缓解、课堂犯困；对白独立排版，图下保留简短机制说明，不重复设置场景小标题。</w:t>
-      </w:r>
-    </w:p>
-    <w:p>
-      <w:r>
-        <w:t>分工与时间：甲，60秒。依据：S8。</w:t>
-      </w:r>
-    </w:p>
-    <w:p>
-      <w:pPr>
-        <w:pStyle w:val="Heading2"/>
-      </w:pPr>
-      <w:r>
-        <w:t>06｜两盒药，是“双保险”还是撞车？</w:t>
+        <w:t>05｜两盒药，是“双保险”还是撞车？</w:t>
       </w:r>
     </w:p>
     <w:p>
@@ -577,7 +549,7 @@
     </w:p>
     <w:p>
       <w:r>
-        <w:t>底部关键句：虚构情境｜包装不同，成分可能重复。</w:t>
+        <w:t>底部关键句：包装不同，也可能含有同一成分。</w:t>
       </w:r>
     </w:p>
     <w:p>
@@ -595,7 +567,7 @@
         <w:pStyle w:val="Heading2"/>
       </w:pPr>
       <w:r>
-        <w:t>07｜药盒不同，成分可能“撞车”</w:t>
+        <w:t>06｜药盒不同，成分可能“撞车”</w:t>
       </w:r>
     </w:p>
     <w:p>
@@ -623,7 +595,7 @@
         <w:pStyle w:val="Heading2"/>
       </w:pPr>
       <w:r>
-        <w:t>08｜18点吃过药，20点还痛：先补哪条信息？</w:t>
+        <w:t>07｜18点吃过药，20点还痛：先补哪条信息？</w:t>
       </w:r>
     </w:p>
     <w:p>
@@ -633,12 +605,12 @@
     </w:p>
     <w:p>
       <w:r>
-        <w:t>底部关键句：时间只是故事线索，不是推荐给药间隔｜先补信息，不凭感觉加药</w:t>
+        <w:t>底部关键句：成分、规格、今天吃过什么：先核清，再决定。</w:t>
       </w:r>
     </w:p>
     <w:p>
       <w:r>
-        <w:t>视觉：动漫核药时间线；仅保留实际18:00与20:00时间信息，图片下直接说明已服药、症状及核对信息，不叠加阶段名称。</w:t>
+        <w:t>视觉：三幅全新动漫分镜：傍晚查看用药记录、夜间症状仍在、俯视核对两盒药和说明书；每幅仅在本页使用。</w:t>
       </w:r>
     </w:p>
     <w:p>
@@ -651,7 +623,7 @@
         <w:pStyle w:val="Heading2"/>
       </w:pPr>
       <w:r>
-        <w:t>09｜室友群的三条消息，你给哪条点赞？</w:t>
+        <w:t>08｜室友群的三条消息，你给哪条点赞？</w:t>
       </w:r>
     </w:p>
     <w:p>
@@ -679,7 +651,7 @@
         <w:pStyle w:val="Heading2"/>
       </w:pPr>
       <w:r>
-        <w:t>10｜答案 A＋C：先把两类信息凑齐</w:t>
+        <w:t>09｜答案 A＋C：先把两类信息凑齐</w:t>
       </w:r>
     </w:p>
     <w:p>
@@ -707,7 +679,7 @@
         <w:pStyle w:val="Heading2"/>
       </w:pPr>
       <w:r>
-        <w:t>11｜案例②：抗生素，不是感冒的通用答案</w:t>
+        <w:t>10｜案例②：抗生素，不是感冒的通用答案</w:t>
       </w:r>
     </w:p>
     <w:p>
@@ -735,22 +707,22 @@
         <w:pStyle w:val="Heading2"/>
       </w:pPr>
       <w:r>
-        <w:t>12｜不需要的抗生素，也可能带来真实伤害</w:t>
+        <w:t>11｜不需要的抗生素，也可能带来真实伤害</w:t>
       </w:r>
     </w:p>
     <w:p>
       <w:r>
-        <w:t>页面短文案：至少28%｜美国门诊抗生素处方被估计为不必要；最高10倍｜用药期间及结束后1个月，艰难梭菌感染风险可升高；没有预期获益的用药，也会暴露于不良反应风险</w:t>
+        <w:t>页面短文案：至少28%｜美国门诊抗生素处方被估计为不必要；药物副作用导致的急诊｜5次中，约1次涉及抗生素；不需要时用药，也要承担副作用风险</w:t>
       </w:r>
     </w:p>
     <w:p>
       <w:r>
-        <w:t>底部关键句：28%是处方比例，10倍是风险上限说明；口径不同，不能相乘或推算个人概率。</w:t>
+        <w:t>底部关键句：没有治疗需要，也要承担用药风险。</w:t>
       </w:r>
     </w:p>
     <w:p>
       <w:r>
-        <w:t>视觉：蓝与珊瑚红的双图：左侧100格中28格高亮并注明美国门诊2014—2015估计；右侧共同0—10刻度的基准1与最高10倍相对风险示意。注明CDC所述用药期间及结束后1个月，不画成10%的发生率。</w:t>
+        <w:t>视觉：双图并排：左侧100格中28格珊瑚红高亮，右侧五个急诊图标中一个红色突出抗生素反应。正文写清药物副作用导致的急诊这一分母；数据年份、范围和来源保留在备注和附页。</w:t>
       </w:r>
     </w:p>
     <w:p>
@@ -763,7 +735,7 @@
         <w:pStyle w:val="Heading2"/>
       </w:pPr>
       <w:r>
-        <w:t>13｜把“别乱吃抗生素”，换成三个动作</w:t>
+        <w:t>12｜把“别乱吃抗生素”，换成三个动作</w:t>
       </w:r>
     </w:p>
     <w:p>
@@ -791,22 +763,22 @@
         <w:pStyle w:val="Heading2"/>
       </w:pPr>
       <w:r>
-        <w:t>14｜案例③：鼻子舒服了，上课却困了</w:t>
+        <w:t>13｜案例③：鼻子舒服了，上课却犯困</w:t>
       </w:r>
     </w:p>
     <w:p>
       <w:r>
-        <w:t>页面短文案：查看说明书中的嗜睡提示；告诉药师：白天有课、需要通勤；已经困倦时，避开驾驶或骑车</w:t>
+        <w:t>页面短文案：鼻子舒服了，课堂上却开始犯困；查嗜睡提示，说明上课和通勤需求；已经困倦时，避开驾驶或骑车</w:t>
       </w:r>
     </w:p>
     <w:p>
       <w:r>
-        <w:t>底部关键句：“较少嗜睡”不等于人人不困；第一次使用时尤其留意个人反应。</w:t>
+        <w:t>底部关键句：症状缓解，也要留意精神状态与日常活动。</w:t>
       </w:r>
     </w:p>
     <w:p>
       <w:r>
-        <w:t>视觉：左侧为动漫课堂犯困分镜与一句对白；右侧为三个完整行动句，取消先查、再说等重复小标题。</w:t>
+        <w:t>视觉：两幅独立动漫分镜：鼻部症状缓解、课堂犯困；各用一句对白呈现现象，后页自然引出组胺机制。</w:t>
       </w:r>
     </w:p>
     <w:p>
@@ -819,7 +791,7 @@
         <w:pStyle w:val="Heading2"/>
       </w:pPr>
       <w:r>
-        <w:t>15｜同一种组胺信号，为什么有两种影响？</w:t>
+        <w:t>14｜同一种组胺信号，为什么有两种影响？</w:t>
       </w:r>
     </w:p>
     <w:p>
@@ -829,7 +801,7 @@
     </w:p>
     <w:p>
       <w:r>
-        <w:t>底部关键句：这是简化机制图；不能据此自行换药。</w:t>
+        <w:t>底部关键句：同一种信号，在鼻部和脑内承担不同作用。</w:t>
       </w:r>
     </w:p>
     <w:p>
@@ -847,7 +819,7 @@
         <w:pStyle w:val="Heading2"/>
       </w:pPr>
       <w:r>
-        <w:t>16｜聚餐邀请到了，你先回哪条消息？</w:t>
+        <w:t>15｜聚餐邀请到了，你先回哪条消息？</w:t>
       </w:r>
     </w:p>
     <w:p>
@@ -875,7 +847,7 @@
         <w:pStyle w:val="Heading2"/>
       </w:pPr>
       <w:r>
-        <w:t>17｜案例④：聚餐这杯酒，先停一下</w:t>
+        <w:t>16｜案例④：聚餐这杯酒，先停一下</w:t>
       </w:r>
     </w:p>
     <w:p>
@@ -903,7 +875,7 @@
         <w:pStyle w:val="Heading2"/>
       </w:pPr>
       <w:r>
-        <w:t>18｜安全用药四步：看、核、问、记</w:t>
+        <w:t>17｜安全用药四步：看、核、问、记</w:t>
       </w:r>
     </w:p>
     <w:p>
@@ -931,7 +903,7 @@
         <w:pStyle w:val="Heading2"/>
       </w:pPr>
       <w:r>
-        <w:t>19｜说明书很长？先定位这六处</w:t>
+        <w:t>18｜说明书很长？先定位这六处</w:t>
       </w:r>
     </w:p>
     <w:p>
@@ -941,7 +913,7 @@
     </w:p>
     <w:p>
       <w:r>
-        <w:t>底部关键句：六处是阅读起点，不代表其余内容可以跳过。</w:t>
+        <w:t>底部关键句：先找成分、用法和禁忌，把关键信息看清。</w:t>
       </w:r>
     </w:p>
     <w:p>
@@ -959,7 +931,7 @@
         <w:pStyle w:val="Heading2"/>
       </w:pPr>
       <w:r>
-        <w:t>20｜时间、剂量、剂型，都别凭感觉改</w:t>
+        <w:t>19｜时间、剂量、剂型，都别凭感觉改</w:t>
       </w:r>
     </w:p>
     <w:p>
@@ -974,7 +946,7 @@
     </w:p>
     <w:p>
       <w:r>
-        <w:t>视觉：时间、剂量、剂型三张行动卡，各配一张药物或药房实拍照片。；另嵌入真实照片：pill-bottle.jpg、pharmacy-01.jpg、tablet-hand.jpg</w:t>
+        <w:t>视觉：三张浅底色行动卡：漏服用钟表与问号，疗程用处方清单，剂型用完整药片与保护层；图形可编辑，无重复照片。</w:t>
       </w:r>
     </w:p>
     <w:p>
@@ -987,7 +959,7 @@
         <w:pStyle w:val="Heading2"/>
       </w:pPr>
       <w:r>
-        <w:t>21｜问药师时，把信息一次说清</w:t>
+        <w:t>20｜问药师时，把信息一次说清</w:t>
       </w:r>
     </w:p>
     <w:p>
@@ -1015,7 +987,7 @@
         <w:pStyle w:val="Heading2"/>
       </w:pPr>
       <w:r>
-        <w:t>22｜什么时候，不该继续自己试药？</w:t>
+        <w:t>21｜什么时候，不该继续自己试药？</w:t>
       </w:r>
     </w:p>
     <w:p>
@@ -1043,7 +1015,7 @@
         <w:pStyle w:val="Heading2"/>
       </w:pPr>
       <w:r>
-        <w:t>23｜宿舍药箱：留信息，也留秩序</w:t>
+        <w:t>22｜宿舍药箱：留信息，也留秩序</w:t>
       </w:r>
     </w:p>
     <w:p>
@@ -1071,7 +1043,7 @@
         <w:pStyle w:val="Heading2"/>
       </w:pPr>
       <w:r>
-        <w:t>24｜把四个误区，换成四个动作</w:t>
+        <w:t>23｜把四个误区，换成四个动作</w:t>
       </w:r>
     </w:p>
     <w:p>
@@ -1099,7 +1071,7 @@
         <w:pStyle w:val="Heading2"/>
       </w:pPr>
       <w:r>
-        <w:t>25｜综合挑战：小苏今晚怎么安排？</w:t>
+        <w:t>24｜综合挑战：小苏今晚怎么安排？</w:t>
       </w:r>
     </w:p>
     <w:p>
@@ -1109,12 +1081,12 @@
     </w:p>
     <w:p>
       <w:r>
-        <w:t>底部关键句：虚构情境｜无呼吸困难、意识异常等急症表现。</w:t>
+        <w:t>底部关键句：成分没核对，饮酒要求也还没确认。</w:t>
       </w:r>
     </w:p>
     <w:p>
       <w:r>
-        <w:t>视觉：手持药片实拍照片配三条虚构综合情境线索。；另嵌入真实照片：tablet-hand.jpg</w:t>
+        <w:t>视觉：全新动漫全景：小苏背包站在桌旁，对着两盒药和聚餐手机消息思考；旁边呈现三条短线索。</w:t>
       </w:r>
     </w:p>
     <w:p>
@@ -1127,7 +1099,7 @@
         <w:pStyle w:val="Heading2"/>
       </w:pPr>
       <w:r>
-        <w:t>26｜小苏的晚间计划，你采纳哪几条？</w:t>
+        <w:t>25｜小苏的晚间计划，你采纳哪几条？</w:t>
       </w:r>
     </w:p>
     <w:p>
@@ -1155,7 +1127,7 @@
         <w:pStyle w:val="Heading2"/>
       </w:pPr>
       <w:r>
-        <w:t>27｜答案 A＋B：把建议拼成完整行动</w:t>
+        <w:t>26｜答案 A＋B：把建议拼成完整行动</w:t>
       </w:r>
     </w:p>
     <w:p>
@@ -1183,7 +1155,7 @@
         <w:pStyle w:val="Heading2"/>
       </w:pPr>
       <w:r>
-        <w:t>28｜药可以常备，判断不能省略</w:t>
+        <w:t>27｜药可以常备，判断不能省略</w:t>
       </w:r>
     </w:p>
     <w:p>
@@ -1216,17 +1188,17 @@
     </w:p>
     <w:p>
       <w:r>
-        <w:t>第8页为虚构宿舍用药案例，不再展示模拟超量研究比例。18点与20点只作故事时间线，不是给药间隔；核对具体药名、成分、规格与已服时间和用量。依据S2。</w:t>
+        <w:t>第7页为虚构宿舍用药案例，不再展示模拟超量研究比例。18点与20点只作故事时间线，不是给药间隔；核对具体药名、成分、规格与已服时间和用量。依据S2。</w:t>
       </w:r>
     </w:p>
     <w:p>
       <w:r>
-        <w:t>第12页左图：CDC汇总美国门诊抗生素处方至少28%不必要，其所引Hersh等2021年论文该估计来自2014—2015年。100格只高亮28格，剩余格不表示全部合理，不把它当成中国或大学生发生率。右图：CDC About C. diff（2026年5月更新）指出用药期间及结束后1个月，艰难梭菌感染风险最高可达10倍。条形以1为比较基准，只展示最高风险倍数，不表示人人风险或绝对发生率。两图不同口径不能相乘。来源S5、S15、S16。</w:t>
+        <w:t>第11页左图：CDC汇总美国门诊抗生素处方至少28%不必要，所引Hersh等2021年论文该估计来自2014—2015年。100格高亮28格，剩余格不表示全部合理，不把它当成中国或大学生发生率。右图：CDC科普资料指出，药物相关急诊约五次有一次由抗生素反应引起。五个急诊图标突出一个；分母为药物反应相关急诊，不是所有急诊，也不是每五名服药者有一人进急诊。不将所有反应归因于滥用，不把两图比例相乘。来源S5、S15、S16。</w:t>
       </w:r>
     </w:p>
     <w:p>
       <w:r>
-        <w:t>处方比例采用100格图，风险倍数采用共用0—10刻度的条形示意；不同口径各自成图，不将两数混在同一数轴。原始数值、地域、时间窗与解释边界另附CSV。</w:t>
+        <w:t>处方比例采用100格图；药物相关急诊中抗生素反应约占五分之一，用五个急诊图标突出一个表示。图标代表统计比例，不表示服药者个人风险。来源、统计范围和解释边界另附CSV，主讲页面保留结论与必要分母。</w:t>
       </w:r>
     </w:p>
     <w:p>
@@ -1571,7 +1543,7 @@
     </w:p>
     <w:p>
       <w:r>
-        <w:t>[S15] CDC. About C. diff（2026更新；用药期间及结束后1个月感染风险最高10倍）</w:t>
+        <w:t>[S15] CDC. Do antibiotics have side effects?（药物相关急诊约1/5来自抗生素反应）</w:t>
       </w:r>
     </w:p>
     <w:p>
@@ -1579,7 +1551,7 @@
         <w:spacing w:after="200"/>
       </w:pPr>
       <w:r>
-        <w:t>https://www.cdc.gov/c-diff/about/</w:t>
+        <w:t>https://www.cdc.gov/antibiotic-use/media/pdfs/Do-Antibiotics-Have-Side-Effects-508.pdf</w:t>
       </w:r>
     </w:p>
     <w:p>
@@ -1647,30 +1619,6 @@
     </w:p>
     <w:p>
       <w:r>
-        <w:t>college-campus.jpg｜George Pak｜Pexels License</w:t>
-      </w:r>
-    </w:p>
-    <w:p>
-      <w:r>
-        <w:t>https://www.pexels.com/photo/7972512/</w:t>
-        <w:br/>
-        <w:t>https://www.pexels.com/license/</w:t>
-      </w:r>
-    </w:p>
-    <w:p>
-      <w:r>
-        <w:t>evening.jpg｜LZ Jian｜Pexels License</w:t>
-      </w:r>
-    </w:p>
-    <w:p>
-      <w:r>
-        <w:t>https://www.pexels.com/photo/black-lamp-beside-bed-5968800/</w:t>
-        <w:br/>
-        <w:t>https://www.pexels.com/license/</w:t>
-      </w:r>
-    </w:p>
-    <w:p>
-      <w:r>
         <w:t>pharmacy-01.jpg｜Árpád Czapp｜Unsplash License</w:t>
       </w:r>
     </w:p>
@@ -1689,18 +1637,6 @@
     <w:p>
       <w:r>
         <w:t>https://unsplash.com/photos/pharmacist-reaching-for-medication-on-shelf-byGTytEGjBo</w:t>
-        <w:br/>
-        <w:t>https://unsplash.com/license</w:t>
-      </w:r>
-    </w:p>
-    <w:p>
-      <w:r>
-        <w:t>pharmacy-03.jpg｜paws and prints｜Unsplash License</w:t>
-      </w:r>
-    </w:p>
-    <w:p>
-      <w:r>
-        <w:t>https://unsplash.com/photos/sQjHIOhiL0E</w:t>
         <w:br/>
         <w:t>https://unsplash.com/license</w:t>
       </w:r>

</xml_diff>

<commit_message>
deliver: publish page rationale and revised design guide
</commit_message>
<xml_diff>
--- a/交付文件/合理用药_大纲与逐页设计说明.docx
+++ b/交付文件/合理用药_大纲与逐页设计说明.docx
@@ -96,7 +96,7 @@
           </w:tcPr>
           <w:p>
             <w:r>
-              <w:t>16:9；模板蓝 #153E75、红 #E3464F、白 #FFFFFF；图示采用青绿、紫色、橙黄点缀；真实照片保留自然色。标题约30pt，主体以20—30pt为主。</w:t>
+              <w:t>16:9；模板蓝 #153E75、红 #E3464F、白 #FFFFFF；图示采用少量协调强调色；正文浅底色卡片与气泡；动漫鲜活，配色与全稿统一。封面合理用药74pt，常规标题约30pt，主体以20—28pt为主。</w:t>
             </w:r>
           </w:p>
         </w:tc>
@@ -118,7 +118,7 @@
           </w:tcPr>
           <w:p>
             <w:r>
-              <w:t>6页主讲使用6张各出现一次的图库照片；17幅不同动漫分镜各出现一次，情境、选择题和综合挑战均避免复用；对白可编辑，画面作为图片替换或裁切，机制图和成分示意均为可编辑形状。</w:t>
+              <w:t>26幅独立动漫画面各出现一次；封面原创核药插画，第17—22页使用独立行动分镜，第24页为新三格综合情境，不使用图库照片；对白可编辑，画面作为图片替换或裁切，机制图和成分示意均为可编辑形状。</w:t>
             </w:r>
           </w:p>
         </w:tc>
@@ -228,7 +228,7 @@
           </w:tcPr>
           <w:p>
             <w:r>
-              <w:t>PPT内含3页隐藏文献附页、2页隐藏图片来源附页；PDF用于预览，编辑请使用PPTX。</w:t>
+              <w:t>PPT内含3页隐藏文献附页、1页隐藏动漫素材附页；PDF用于预览，编辑请使用PPTX。</w:t>
             </w:r>
           </w:p>
         </w:tc>
@@ -312,7 +312,7 @@
           </w:tcPr>
           <w:p>
             <w:r>
-              <w:t>开场路线；情境选择；合理用药四原则；用药现象与信号传递。</w:t>
+              <w:t>主题封面；开场路线；情境选择；合理用药四原则。</w:t>
             </w:r>
           </w:p>
         </w:tc>
@@ -344,7 +344,7 @@
           </w:tcPr>
           <w:p>
             <w:r>
-              <w:t>重复成分；已服药信息核对；抗生素不必要处方及感染风险；抗过敏嗜睡；先投票后聚餐案例。</w:t>
+              <w:t>重复成分；已服药信息核对；抗生素不必要处方及副作用急诊负担；抗过敏嗜睡；先投票后聚餐案例。</w:t>
             </w:r>
           </w:p>
         </w:tc>
@@ -408,7 +408,7 @@
           </w:tcPr>
           <w:p>
             <w:r>
-              <w:t>复方感冒药＋聚餐情境；多选建议；逐项揭晓；三句收尾。</w:t>
+              <w:t>三格复方感冒药＋聚餐情境；等权多选消息；行动卡揭晓；三句收尾。</w:t>
             </w:r>
           </w:p>
         </w:tc>
@@ -432,7 +432,7 @@
     </w:p>
     <w:p>
       <w:r>
-        <w:t>页面短文案：会选药 · 看成分 · 避误区；苏州大学｜选修课课堂展示；主讲：同学甲 / 同学乙</w:t>
+        <w:t>页面短文案：会看 · 会核 · 会问 · 会记；苏州大学｜选修课课堂展示；主讲：同学甲 / 同学乙</w:t>
       </w:r>
     </w:p>
     <w:p>
@@ -442,7 +442,17 @@
     </w:p>
     <w:p>
       <w:r>
-        <w:t>视觉：蓝底白字封面，右侧为手持药片的真实照片。；另嵌入真实照片：tablet-hand.jpg</w:t>
+        <w:t>视觉：白底深蓝大标题合理用药，珊瑚红强调与浅蓝信息块；右侧为全新动漫核药场景，人物、药盒和说明书清楚可见，与全稿画风一致。</w:t>
+      </w:r>
+    </w:p>
+    <w:p>
+      <w:r>
+        <w:t>为什么在这里：用具体核药情境提出合理用药主题，让听众知道接下来练习什么。</w:t>
+      </w:r>
+    </w:p>
+    <w:p>
+      <w:r>
+        <w:t>下一页入口：路线页说明整场如何回答用药问题。</w:t>
       </w:r>
     </w:p>
     <w:p>
@@ -875,22 +885,32 @@
         <w:pStyle w:val="Heading2"/>
       </w:pPr>
       <w:r>
-        <w:t>17｜安全用药四步：看、核、问、记</w:t>
+        <w:t>17｜从四个案例，走到四个用药动作</w:t>
       </w:r>
     </w:p>
     <w:p>
       <w:r>
-        <w:t>页面短文案：看｜症状、说明书、就医信号；核｜成分、剂量、间隔、禁忌；问｜医生 / 药师，确认不确定处；记｜药名、时间、用量与反应</w:t>
+        <w:t>页面短文案：看｜症状、说明书、就医信号；核｜成分、用法、禁忌与相互作用；问｜带齐信息，问医生或药师；记｜药名、时间、用量与反应</w:t>
       </w:r>
     </w:p>
     <w:p>
       <w:r>
-        <w:t>底部关键句：刚才选 C｜把“不确定”变成一个咨询动作。</w:t>
+        <w:t>底部关键句：先把信息看清，再把不确定问清。</w:t>
       </w:r>
     </w:p>
     <w:p>
       <w:r>
-        <w:t>视觉：原创四步流程，标注“课堂助记法”。</w:t>
+        <w:t>视觉：左侧全新动漫核药场景，右侧四张浅底色动作卡；看核问记用统一字级与两种强调色呈现。</w:t>
+      </w:r>
+    </w:p>
+    <w:p>
+      <w:r>
+        <w:t>为什么在这里：前四个案例已经给出判断，现将其提炼为看核问记的方法，开启安全用药部分。</w:t>
+      </w:r>
+    </w:p>
+    <w:p>
+      <w:r>
+        <w:t>下一页入口：先落实看：定位说明书中的关键信息。</w:t>
       </w:r>
     </w:p>
     <w:p>
@@ -903,22 +923,32 @@
         <w:pStyle w:val="Heading2"/>
       </w:pPr>
       <w:r>
-        <w:t>18｜说明书很长？先定位这六处</w:t>
+        <w:t>18｜说明书：先找能改变判断的信息</w:t>
       </w:r>
     </w:p>
     <w:p>
       <w:r>
-        <w:t>页面短文案：成分 / 通用名；适应证或功能主治；用法用量；禁忌与注意事项；相互作用 / 不良反应；贮藏条件 / 有效期</w:t>
+        <w:t>页面短文案：成分 / 通用名｜有没有重复成分？；适应证 / 功能主治｜是否适合这次情况？；用法用量｜一次多少、间隔多久？；禁忌 / 注意事项｜哪些情况需要避开？；相互作用 / 不良反应｜其他药或酒会影响吗？；贮藏 / 有效期｜现在还能否使用？</w:t>
       </w:r>
     </w:p>
     <w:p>
       <w:r>
-        <w:t>底部关键句：先找成分、用法和禁忌，把关键信息看清。</w:t>
+        <w:t>底部关键句：看清成分与用途，再核用法和禁忌。</w:t>
       </w:r>
     </w:p>
     <w:p>
       <w:r>
-        <w:t>视觉：说明书六处阅读清单配药瓶实拍照片；提醒以实际说明书为准。；另嵌入真实照片：pill-bottle.jpg</w:t>
+        <w:t>视觉：左侧六张有浅底色的说明书阅读卡，每张对应一个具体问题；右侧为全新动漫阅读分镜，避免药瓶图库照片。</w:t>
+      </w:r>
+    </w:p>
+    <w:p>
+      <w:r>
+        <w:t>为什么在这里：上一页要求先看，本页把看什么变成六个具体问题。</w:t>
+      </w:r>
+    </w:p>
+    <w:p>
+      <w:r>
+        <w:t>下一页入口：找到用法以后，检查是否擅自改变了使用方式。</w:t>
       </w:r>
     </w:p>
     <w:p>
@@ -931,22 +961,32 @@
         <w:pStyle w:val="Heading2"/>
       </w:pPr>
       <w:r>
-        <w:t>19｜时间、剂量、剂型，都别凭感觉改</w:t>
+        <w:t>19｜核完说明书，使用方式也别随意改</w:t>
       </w:r>
     </w:p>
     <w:p>
       <w:r>
-        <w:t>页面短文案：漏服｜先查具体处理要求，不自行加倍；疗程｜按处方执行，有问题及时咨询；剂型｜缓释、肠溶等，不随意掰碎</w:t>
+        <w:t>页面短文案：漏服｜先查处理要求，不自行加倍；疗程｜按处方执行，有问题及时咨询；剂型｜缓释、肠溶等，不随意掰碎</w:t>
       </w:r>
     </w:p>
     <w:p>
       <w:r>
-        <w:t>底部关键句：不同药物要求不同；不要套用同一条补药规则。</w:t>
+        <w:t>底部关键句：不同药物要求不同，先核具体说明再行动。</w:t>
       </w:r>
     </w:p>
     <w:p>
       <w:r>
-        <w:t>视觉：三张浅底色行动卡：漏服用钟表与问号，疗程用处方清单，剂型用完整药片与保护层；图形可编辑，无重复照片。</w:t>
+        <w:t>视觉：全新动漫核对时钟、药板和说明书；三条使用要求以浅底色横向卡片分层呈现，删除泛化装饰。</w:t>
+      </w:r>
+    </w:p>
+    <w:p>
+      <w:r>
+        <w:t>为什么在这里：说明书已定位，本页落实核：漏服、疗程、剂型的要求都需要核对。</w:t>
+      </w:r>
+    </w:p>
+    <w:p>
+      <w:r>
+        <w:t>下一页入口：核对仍拿不准时，带信息咨询。</w:t>
       </w:r>
     </w:p>
     <w:p>
@@ -959,22 +999,32 @@
         <w:pStyle w:val="Heading2"/>
       </w:pPr>
       <w:r>
-        <w:t>20｜问药师时，把信息一次说清</w:t>
+        <w:t>20｜拿不准时，把三件事告诉药师</w:t>
       </w:r>
     </w:p>
     <w:p>
       <w:r>
-        <w:t>页面短文案：我有什么症状，持续多久？；我正在吃什么，何时吃了多少？；我有哪些过敏史、疾病或特殊情况？</w:t>
+        <w:t>页面短文案：哪里不舒服，已经持续多久？；用了哪些药，何时吃了多少？；有哪些过敏史、疾病或特殊情况？</w:t>
       </w:r>
     </w:p>
     <w:p>
       <w:r>
-        <w:t>底部关键句：带药盒 / 说明书照片，比“那种白色药片”更有用。</w:t>
+        <w:t>底部关键句：带上药盒、说明书与已服记录，让咨询更准确。</w:t>
       </w:r>
     </w:p>
     <w:p>
       <w:r>
-        <w:t>视觉：药师取药实拍照片配咨询时需要说明的三类信息。；另嵌入真实照片：pharmacy-02.jpg</w:t>
+        <w:t>视觉：全新药师咨询动漫画面与一句可编辑对白；右侧三条等宽浅底色气泡，分别呈现症状、已服信息和个人情况。</w:t>
+      </w:r>
+    </w:p>
+    <w:p>
+      <w:r>
+        <w:t>为什么在这里：前页保留了不确定情况，本页说明咨询时必须提供什么。</w:t>
+      </w:r>
+    </w:p>
+    <w:p>
+      <w:r>
+        <w:t>下一页入口：常规咨询之外，严重信号需要优先求助。</w:t>
       </w:r>
     </w:p>
     <w:p>
@@ -987,7 +1037,7 @@
         <w:pStyle w:val="Heading2"/>
       </w:pPr>
       <w:r>
-        <w:t>21｜什么时候，不该继续自己试药？</w:t>
+        <w:t>21｜出现这些信号，别继续自己试药</w:t>
       </w:r>
     </w:p>
     <w:p>
@@ -997,12 +1047,22 @@
     </w:p>
     <w:p>
       <w:r>
-        <w:t>底部关键句：严重急症拨打120；带上药品信息，别等“自己好”。</w:t>
+        <w:t>底部关键句：严重信号优先求助，别等症状“自己好”。</w:t>
       </w:r>
     </w:p>
     <w:p>
       <w:r>
-        <w:t>视觉：红色120急救块、危险信号清单及医院走廊实拍照片。；另嵌入真实照片：hospital-02.jpg</w:t>
+        <w:t>视觉：珊瑚红120急救卡突出严重信号；另两张浅底色行动卡区分误服与持续症状；右侧全新室友求助动漫，不用医院走廊照片。</w:t>
+      </w:r>
+    </w:p>
+    <w:p>
+      <w:r>
+        <w:t>为什么在这里：上一页讲常规咨询，本页补足何时应转为就医或急救这一边界。</w:t>
+      </w:r>
+    </w:p>
+    <w:p>
+      <w:r>
+        <w:t>下一页入口：求助需要准确用药信息，转入包装与记录保留。</w:t>
       </w:r>
     </w:p>
     <w:p>
@@ -1015,22 +1075,32 @@
         <w:pStyle w:val="Heading2"/>
       </w:pPr>
       <w:r>
-        <w:t>22｜宿舍药箱：留信息，也留秩序</w:t>
+        <w:t>22｜药箱不求满，信息要留全</w:t>
       </w:r>
     </w:p>
     <w:p>
       <w:r>
-        <w:t>页面短文案：原包装＋说明书｜一起保留；有效期＋贮藏条件｜定期检查；个人用药记录｜不混装、不分享处方药</w:t>
+        <w:t>页面短文案：保留原包装｜药盒和说明书一起留；检查有效期｜同时核对贮藏要求；留好用药记录｜药名、时间、用量与反应</w:t>
       </w:r>
     </w:p>
     <w:p>
       <w:r>
-        <w:t>底部关键句：数量不求多；需要时能认清、查到、说清。</w:t>
+        <w:t>底部关键句：不混装，不分享处方药；记录让下次咨询更准确。</w:t>
       </w:r>
     </w:p>
     <w:p>
       <w:r>
-        <w:t>视觉：药房实拍照片配宿舍药箱管理的三条行动提示。；另嵌入真实照片：pharmacy-01.jpg</w:t>
+        <w:t>视觉：全新动漫整理药箱，包装、说明书和手机记录一同入画；右侧三张浅底色便签，突出信息保留。</w:t>
+      </w:r>
+    </w:p>
+    <w:p>
+      <w:r>
+        <w:t>为什么在这里：咨询和就医都依赖准确记录，本页落实记与药箱管理。</w:t>
+      </w:r>
+    </w:p>
+    <w:p>
+      <w:r>
+        <w:t>下一页入口：把方法重新对应到前面的四个案例。</w:t>
       </w:r>
     </w:p>
     <w:p>
@@ -1043,22 +1113,32 @@
         <w:pStyle w:val="Heading2"/>
       </w:pPr>
       <w:r>
-        <w:t>23｜把四个误区，换成四个动作</w:t>
+        <w:t>23｜把四个案例，变成四个下一步</w:t>
       </w:r>
     </w:p>
     <w:p>
       <w:r>
-        <w:t>页面短文案：感冒药叠加 → 核对成分；感冒吃抗生素 → 先确认是否需要；抗过敏后困倦 → 查提示、避高风险活动；吃药后聚餐 → 先核实饮酒要求</w:t>
+        <w:t>页面短文案：叠加感冒药 → 核对重复成分与已服记录；感冒想到抗生素 → 先确认是否需要；用药后困倦 → 查提示，避开高风险活动；服药后聚餐 → 先核实饮酒要求</w:t>
       </w:r>
     </w:p>
     <w:p>
       <w:r>
-        <w:t>底部关键句：看、核、问、记：现在进入简单挑战。</w:t>
+        <w:t>底部关键句：方法已经齐了：接下来替小苏做一次选择。</w:t>
       </w:r>
     </w:p>
     <w:p>
       <w:r>
-        <w:t>视觉：五行“场景→动作”映射；每行配一个小图标。</w:t>
+        <w:t>视觉：四条浅底色情境到行动的配对带，以明确箭头连接，不堆砌裸文字；作为方法部分与综合挑战的桥梁。</w:t>
+      </w:r>
+    </w:p>
+    <w:p>
+      <w:r>
+        <w:t>为什么在这里：方法部分完成，本页把每个案例与下一步配对，准备迁移练习。</w:t>
+      </w:r>
+    </w:p>
+    <w:p>
+      <w:r>
+        <w:t>下一页入口：综合情境同时出现两个信息缺口。</w:t>
       </w:r>
     </w:p>
     <w:p>
@@ -1071,22 +1151,32 @@
         <w:pStyle w:val="Heading2"/>
       </w:pPr>
       <w:r>
-        <w:t>24｜综合挑战：小苏今晚怎么安排？</w:t>
+        <w:t>24｜综合挑战：两盒药，一场聚餐</w:t>
       </w:r>
     </w:p>
     <w:p>
       <w:r>
-        <w:t>页面短文案：已服：一种复方感冒药；准备：再加一盒药＋参加聚餐；当前：成分没核对，症状尚轻</w:t>
+        <w:t>页面短文案：白天吃过一种复方感冒药。；还不舒服，要加第二盒吗？；今晚聚餐，药和酒能搭吗？</w:t>
       </w:r>
     </w:p>
     <w:p>
       <w:r>
-        <w:t>底部关键句：成分没核对，饮酒要求也还没确认。</w:t>
+        <w:t>底部关键句：症状较轻；两盒成分与饮酒要求都未核实。</w:t>
       </w:r>
     </w:p>
     <w:p>
       <w:r>
-        <w:t>视觉：全新动漫全景：小苏背包站在桌旁，对着两盒药和聚餐手机消息思考；旁边呈现三条短线索。</w:t>
+        <w:t>视觉：三幅全新动漫分镜：已服药、想加第二盒、准备聚餐；短对白独立可编辑，信息缺口留给下一页选择，不提前给答案。</w:t>
+      </w:r>
+    </w:p>
+    <w:p>
+      <w:r>
+        <w:t>为什么在这里：前页已经建立方法，现在提供综合练习所需的情境和条件。</w:t>
+      </w:r>
+    </w:p>
+    <w:p>
+      <w:r>
+        <w:t>下一页入口：下一页根据这些条件投票，不提前揭晓。</w:t>
       </w:r>
     </w:p>
     <w:p>
@@ -1109,12 +1199,22 @@
     </w:p>
     <w:p>
       <w:r>
-        <w:t>底部关键句：可多选 A / B / C｜逐条判断；想10秒，再举手</w:t>
+        <w:t>底部关键句：可多选：哪些安排能补齐判断所需的信息？</w:t>
       </w:r>
     </w:p>
     <w:p>
       <w:r>
         <w:t>视觉：等权选择卡与小苏动漫肖像；仅保留单选或多选标记，不重复添加提示小标题；不按答案区别格式。</w:t>
+      </w:r>
+    </w:p>
+    <w:p>
+      <w:r>
+        <w:t>为什么在这里：情境已明确，现用多选检验能否同时处理两个信息缺口。</w:t>
+      </w:r>
+    </w:p>
+    <w:p>
+      <w:r>
+        <w:t>下一页入口：投票后逐项解释成立或不足的原因。</w:t>
       </w:r>
     </w:p>
     <w:p>
@@ -1127,12 +1227,12 @@
         <w:pStyle w:val="Heading2"/>
       </w:pPr>
       <w:r>
-        <w:t>26｜答案 A＋B：把建议拼成完整行动</w:t>
+        <w:t>26｜答案 A＋B：把两条建议一起做</w:t>
       </w:r>
     </w:p>
     <w:p>
       <w:r>
-        <w:t>页面短文案：A 饮酒要求未明 → 先用白水，再查询；B 药盒与已服记录 → 一起核对，再决定；C 沿用经验错开时间 → 信息缺口仍在</w:t>
+        <w:t>页面短文案：A 先用白水｜饮酒要求未明，先不喝酒；B 带齐信息核对｜两盒药和已服记录，一起问药师；C 改到睡前｜仍没补齐成分与已服信息</w:t>
       </w:r>
     </w:p>
     <w:p>
@@ -1142,7 +1242,17 @@
     </w:p>
     <w:p>
       <w:r>
-        <w:t>视觉：大号B＋三个“线索→行动”映射。</w:t>
+        <w:t>视觉：左侧大号A＋B结论块，右侧两张行动卡与一张辨析卡；浅底色、清楚层次，解释为何错开时间仍未解决问题。</w:t>
+      </w:r>
+    </w:p>
+    <w:p>
+      <w:r>
+        <w:t>为什么在这里：上一页完成选择，本页解释A与B如何拼成行动，C为何仍缺信息。</w:t>
+      </w:r>
+    </w:p>
+    <w:p>
+      <w:r>
+        <w:t>下一页入口：收尾只归纳已建立的行动。</w:t>
       </w:r>
     </w:p>
     <w:p>
@@ -1160,7 +1270,7 @@
     </w:p>
     <w:p>
       <w:r>
-        <w:t>页面短文案：先看说明书，再做用药决定；核对重复成分，记录已服药物；拿不准，问医生 / 药师</w:t>
+        <w:t>页面短文案：看清说明书与实际需要；核对成分，留下已服记录；拿不准，问医生或药师</w:t>
       </w:r>
     </w:p>
     <w:p>
@@ -1170,7 +1280,17 @@
     </w:p>
     <w:p>
       <w:r>
-        <w:t>视觉：蓝底白字收尾，右侧为医疗空间实拍照片。；另嵌入真实照片：clinic-01.jpg</w:t>
+        <w:t>视觉：白底深蓝大标题与珊瑚红点缀呼应封面；三张有底色的行动条与原创可编辑药箱、说明书、记录图示，无复用照片。</w:t>
+      </w:r>
+    </w:p>
+    <w:p>
+      <w:r>
+        <w:t>为什么在这里：所有案例与选择已闭环，归纳可带走的动作，呼应封面。</w:t>
+      </w:r>
+    </w:p>
+    <w:p>
+      <w:r>
+        <w:t>下一页入口：演讲结束，资料附页供课后核查。</w:t>
       </w:r>
     </w:p>
     <w:p>
@@ -1577,97 +1697,37 @@
     </w:p>
     <w:p>
       <w:r>
-        <w:t>情境漫画使用2026-10-12生成的原创动漫分镜，统一小苏与室友形象，非真实学生或事件。宿舍核药、课堂困倦和聚餐场景均使用动漫画面；情境、对话、悬念等阶段标签已删除，仅保留实际时间与题型等必要信息。对白为可编辑PPT文字，图片可替换或裁切。原图和说明见source/assets/anime/。</w:t>
-      </w:r>
-    </w:p>
-    <w:p>
-      <w:pPr>
-        <w:pStyle w:val="Heading1"/>
-      </w:pPr>
-      <w:r>
-        <w:t>真实照片来源与许可</w:t>
+        <w:t>封面与第17—27页按PPT_SKILL整改：先判断页面位置，再落实具体文案、浅底色容器、鲜活动漫与注解精简。第17—23页按方法展开，第24—26页先情境、后多选、再揭晓，第27页呼应封面。27页主讲，35分钟计划保持。</w:t>
       </w:r>
     </w:p>
     <w:p>
       <w:r>
-        <w:t>以下均为真实图库照片，非生成图。图库照片仅说明场景；人物、药品、建筑与小苏虚构案例无关，也不代表苏州大学校园。Pexels 与 Unsplash 许可允许将照片用于演示文稿；保留摄影者与原图链接便于复核。</w:t>
+        <w:t>本版26幅独立动漫画面各出现一次，无实拍图库照片。原图保存在source/assets/anime/；对白、图表和机制文字可编辑，画面使用PowerPoint原生裁切。素材生成方式、时间与分镜分配保存在素材附页、图片素材与页码.csv及ART_NOTES.md，不在主讲页添加重复说明。</w:t>
       </w:r>
     </w:p>
     <w:p>
       <w:r>
-        <w:t>tablet-hand.jpg｜Towfiqu barbhuiya｜Pexels License</w:t>
+        <w:t>cover_rational.png｜封面：一起核对药盒与说明书｜生成：2026-10-13｜使用页：1</w:t>
       </w:r>
     </w:p>
     <w:p>
       <w:r>
-        <w:t>https://www.pexels.com/photo/hand-holding-a-pill-15703464/</w:t>
-        <w:br/>
-        <w:t>https://www.pexels.com/license/</w:t>
+        <w:t>storyboard.png｜宿舍、课堂与聚餐分镜｜生成：2026-10-12｜使用页：5、13、16</w:t>
       </w:r>
     </w:p>
     <w:p>
       <w:r>
-        <w:t>pill-bottle.jpg｜Pexels photo 16051935｜Pexels License</w:t>
+        <w:t>unique_scenes.png｜核药时间线、四道题与组胺肖像｜生成：2026-10-12｜使用页：3、7、8、14、15、25</w:t>
       </w:r>
     </w:p>
     <w:p>
       <w:r>
-        <w:t>https://www.pexels.com/photo/16051935/</w:t>
-        <w:br/>
-        <w:t>https://www.pexels.com/license/</w:t>
+        <w:t>actions_storyboard.png｜查、核、问、求助、记录与综合案例｜生成：2026-10-13｜使用页：17、18、19、20、21、22、24</w:t>
       </w:r>
     </w:p>
     <w:p>
       <w:r>
-        <w:t>pharmacy-01.jpg｜Árpád Czapp｜Unsplash License</w:t>
-      </w:r>
-    </w:p>
-    <w:p>
-      <w:r>
-        <w:t>https://unsplash.com/photos/a-room-filled-with-lots-of-shelves-filled-with-boxes-and-boxes-tvP6pCnq9iI</w:t>
-        <w:br/>
-        <w:t>https://unsplash.com/license</w:t>
-      </w:r>
-    </w:p>
-    <w:p>
-      <w:r>
-        <w:t>pharmacy-02.jpg｜National Cancer Institute｜Unsplash License</w:t>
-      </w:r>
-    </w:p>
-    <w:p>
-      <w:r>
-        <w:t>https://unsplash.com/photos/pharmacist-reaching-for-medication-on-shelf-byGTytEGjBo</w:t>
-        <w:br/>
-        <w:t>https://unsplash.com/license</w:t>
-      </w:r>
-    </w:p>
-    <w:p>
-      <w:r>
-        <w:t>hospital-02.jpg｜Tasha Kostyuk｜Unsplash License</w:t>
-      </w:r>
-    </w:p>
-    <w:p>
-      <w:r>
-        <w:t>https://unsplash.com/photos/empty-hospital-corridor-with-benches-and-doors-Pk-KuizxQv8</w:t>
-        <w:br/>
-        <w:t>https://unsplash.com/license</w:t>
-      </w:r>
-    </w:p>
-    <w:p>
-      <w:r>
-        <w:t>clinic-01.jpg｜Martha Dominguez de Gouveia｜Unsplash License</w:t>
-      </w:r>
-    </w:p>
-    <w:p>
-      <w:r>
-        <w:t>https://unsplash.com/photos/hospital-lobby-reception-with-signage-nMyM7fxpokE</w:t>
-        <w:br/>
-        <w:t>https://unsplash.com/license</w:t>
-      </w:r>
-    </w:p>
-    <w:p>
-      <w:r>
-        <w:t>原始资料：2026-10-09；新增CDC数据核对与版面修订：2026-10-12。网页更新时间可能改变；论文数值按上述固定发表版本使用。全文由课堂语言转述，未照搬整段原文或未授权品牌图像。</w:t>
+        <w:t>原始资料：2026-10-09；新增CDC数据核对：2026-10-12；封面与后半段整改：2026-10-13。网页更新时间可能改变；研究数据保持上述固定口径。</w:t>
       </w:r>
     </w:p>
     <w:sectPr>

</xml_diff>

<commit_message>
deliver: document mechanism illustration rationale and references
</commit_message>
<xml_diff>
--- a/交付文件/合理用药_大纲与逐页设计说明.docx
+++ b/交付文件/合理用药_大纲与逐页设计说明.docx
@@ -118,7 +118,7 @@
           </w:tcPr>
           <w:p>
             <w:r>
-              <w:t>26幅独立动漫画面各出现一次；封面原创核药插画，第17—22页使用独立行动分镜，第24页为新三格综合情境，不使用图库照片；对白可编辑，画面作为图片替换或裁切，机制图和成分示意均为可编辑形状。</w:t>
+              <w:t>25幅动漫与2幅独立医学科普插图各出现一次；封面原创核药插画，第17—22页使用独立行动分镜，第24页为新三格综合情境，不使用图库照片；对白可编辑，画面作为图片替换或裁切，机制图和成分示意均为可编辑形状。</w:t>
             </w:r>
           </w:p>
         </w:tc>
@@ -228,7 +228,7 @@
           </w:tcPr>
           <w:p>
             <w:r>
-              <w:t>PPT内含3页隐藏文献附页、1页隐藏动漫素材附页；PDF用于预览，编辑请使用PPTX。</w:t>
+              <w:t>PPT内含3页隐藏文献附页、2页隐藏插图素材附页；PDF用于预览，编辑请使用PPTX。</w:t>
             </w:r>
           </w:p>
         </w:tc>
@@ -801,27 +801,37 @@
         <w:pStyle w:val="Heading2"/>
       </w:pPr>
       <w:r>
-        <w:t>14｜同一种组胺信号，为什么有两种影响？</w:t>
+        <w:t>14｜抗组胺药：为什么鼻子舒服了，人却可能困？</w:t>
       </w:r>
     </w:p>
     <w:p>
       <w:r>
-        <w:t>页面短文案：组胺＋受体｜参与过敏反应；脑内组胺信号｜也参与清醒状态；部分药物进入脑内｜可能引起嗜睡</w:t>
+        <w:t>页面短文案：鼻部H1相关作用｜鼻痒、喷嚏和流涕；抗组胺药｜降低H1相关信号，缓解部分症状；部分药物进入脑内｜影响清醒相关H1信号，可能嗜睡</w:t>
       </w:r>
     </w:p>
     <w:p>
       <w:r>
-        <w:t>底部关键句：同一种信号，在鼻部和脑内承担不同作用。</w:t>
+        <w:t>底部关键句：缓解症状，也要留意嗜睡提示与个人反应。</w:t>
       </w:r>
     </w:p>
     <w:p>
       <w:r>
-        <w:t>视觉：可编辑组胺双路径示意配原创动漫肖像；鼻部、脑内、H1受体及血脑屏障为必要机制标注，保留。</w:t>
+        <w:t>视觉：两幅独立渲染的精细医学科普插图：鼻黏膜组织与感觉神经、脑微血管血脑屏障与神经元。去掉动漫头像和几何器官，保留可编辑组胺、H1受体、药物分子、血脑屏障标注；不呈现猜测的原子结构或整颗药片穿越屏障。</w:t>
       </w:r>
     </w:p>
     <w:p>
       <w:r>
-        <w:t>分工与时间：乙，65秒。依据：S8; S14。</w:t>
+        <w:t>为什么在这里：前页出现鼻部舒服与课堂犯困两个现象，本页解释外周药效与可能的脑内影响。</w:t>
+      </w:r>
+    </w:p>
+    <w:p>
+      <w:r>
+        <w:t>下一页入口：理解治疗作用与日常活动风险可以同时出现，再进入聚餐用药判断。</w:t>
+      </w:r>
+    </w:p>
+    <w:p>
+      <w:r>
+        <w:t>分工与时间：乙，65秒。依据：S8; S14; S17。</w:t>
       </w:r>
     </w:p>
     <w:p>
@@ -1688,11 +1698,29 @@
       </w:r>
     </w:p>
     <w:p>
+      <w:r>
+        <w:t>[S17] Anatomy and Physiology of the Blood-Brain Barrier（脑微血管内皮、紧密连接与支持结构）</w:t>
+      </w:r>
+    </w:p>
+    <w:p>
+      <w:pPr>
+        <w:spacing w:after="200"/>
+      </w:pPr>
+      <w:r>
+        <w:t>https://pmc.ncbi.nlm.nih.gov/articles/PMC4397166/</w:t>
+      </w:r>
+    </w:p>
+    <w:p>
       <w:pPr>
         <w:pStyle w:val="Heading1"/>
       </w:pPr>
       <w:r>
-        <w:t>原创动漫素材</w:t>
+        <w:t>情境与机制插图</w:t>
+      </w:r>
+    </w:p>
+    <w:p>
+      <w:r>
+        <w:t>第14页使用两幅单独渲染的医学科普插图，替换几何器官与动漫头像；组织层次、血脑屏障位置和H1作用按S14、S17核对，标注可编辑。左图解释鼻部症状缓解，右图解释部分药物入脑后可能嗜睡。膜上紫色位置只是功能标记，不是原子结构模型；不画整颗药片穿过屏障，也不把鼻部组胺画成进入脑内的信号。透明PNG另提供于交付文件/机制插图/。</w:t>
       </w:r>
     </w:p>
     <w:p>
@@ -1702,7 +1730,7 @@
     </w:p>
     <w:p>
       <w:r>
-        <w:t>本版26幅独立动漫画面各出现一次，无实拍图库照片。原图保存在source/assets/anime/；对白、图表和机制文字可编辑，画面使用PowerPoint原生裁切。素材生成方式、时间与分镜分配保存在素材附页、图片素材与页码.csv及ART_NOTES.md，不在主讲页添加重复说明。</w:t>
+        <w:t>本版25幅动漫与2幅独立医学科普插图各出现一次，无实拍图库照片。原图保存在source/assets/anime/和source/assets/medical/；对白、图表和机制文字可编辑，画面使用PowerPoint原生裁切。素材生成方式、时间与分镜分配保存在素材附页、图片素材与页码.csv及ART_NOTES.md，不在主讲页添加重复说明。</w:t>
       </w:r>
     </w:p>
     <w:p>
@@ -1717,12 +1745,22 @@
     </w:p>
     <w:p>
       <w:r>
-        <w:t>unique_scenes.png｜核药时间线、四道题与组胺肖像｜生成：2026-10-12｜使用页：3、7、8、14、15、25</w:t>
+        <w:t>unique_scenes.png｜核药时间线与四道题｜生成：2026-10-12｜使用页：3、7、8、15、25</w:t>
       </w:r>
     </w:p>
     <w:p>
       <w:r>
         <w:t>actions_storyboard.png｜查、核、问、求助、记录与综合案例｜生成：2026-10-13｜使用页：17、18、19、20、21、22、24</w:t>
+      </w:r>
+    </w:p>
+    <w:p>
+      <w:r>
+        <w:t>nasal_histamine.png｜鼻黏膜、组胺与感觉神经作用对象｜生成：2026-10-13｜使用页：14</w:t>
+      </w:r>
+    </w:p>
+    <w:p>
+      <w:r>
+        <w:t>brain_bbb_h1.png｜脑微血管、血脑屏障与脑内H1作用对象｜生成：2026-10-13｜使用页：14</w:t>
       </w:r>
     </w:p>
     <w:p>

</xml_diff>